<commit_message>
Save progress: labs BD 2-8, WEB 4-10, CHM, PRSV, Philosophy
Also restore 2KYRS/CMOOP/CourseWork that went missing from the working tree,
ignore Office temp files and *.bak backups.
</commit_message>
<xml_diff>
--- a/2KYRS/BD/LAB/lab1.docx
+++ b/2KYRS/BD/LAB/lab1.docx
@@ -1,10 +1,10 @@
 
 <file path=word/document.xml><?xml version="1.0" encoding="utf-8"?>
-<w:document xmlns:wpc="http://schemas.microsoft.com/office/word/2010/wordprocessingCanvas" xmlns:cx="http://schemas.microsoft.com/office/drawing/2014/chartex" xmlns:cx1="http://schemas.microsoft.com/office/drawing/2015/9/8/chartex" xmlns:cx2="http://schemas.microsoft.com/office/drawing/2015/10/21/chartex" xmlns:cx3="http://schemas.microsoft.com/office/drawing/2016/5/9/chartex" xmlns:cx4="http://schemas.microsoft.com/office/drawing/2016/5/10/chartex" xmlns:cx5="http://schemas.microsoft.com/office/drawing/2016/5/11/chartex" xmlns:cx6="http://schemas.microsoft.com/office/drawing/2016/5/12/chartex" xmlns:cx7="http://schemas.microsoft.com/office/drawing/2016/5/13/chartex" xmlns:cx8="http://schemas.microsoft.com/office/drawing/2016/5/14/chartex" xmlns:mc="http://schemas.openxmlformats.org/markup-compatibility/2006" xmlns:aink="http://schemas.microsoft.com/office/drawing/2016/ink" xmlns:am3d="http://schemas.microsoft.com/office/drawing/2017/model3d" xmlns:o="urn:schemas-microsoft-com:office:office" xmlns:oel="http://schemas.microsoft.com/office/2019/extlst" xmlns:r="http://schemas.openxmlformats.org/officeDocument/2006/relationships" xmlns:m="http://schemas.openxmlformats.org/officeDocument/2006/math" xmlns:v="urn:schemas-microsoft-com:vml" xmlns:wp14="http://schemas.microsoft.com/office/word/2010/wordprocessingDrawing" xmlns:wp="http://schemas.openxmlformats.org/drawingml/2006/wordprocessingDrawing" xmlns:w10="urn:schemas-microsoft-com:office:word" xmlns:w="http://schemas.openxmlformats.org/wordprocessingml/2006/main" xmlns:w14="http://schemas.microsoft.com/office/word/2010/wordml" xmlns:w15="http://schemas.microsoft.com/office/word/2012/wordml" xmlns:w16cex="http://schemas.microsoft.com/office/word/2018/wordml/cex" xmlns:w16cid="http://schemas.microsoft.com/office/word/2016/wordml/cid" xmlns:w16="http://schemas.microsoft.com/office/word/2018/wordml" xmlns:w16du="http://schemas.microsoft.com/office/word/2023/wordml/word16du" xmlns:w16sdtdh="http://schemas.microsoft.com/office/word/2020/wordml/sdtdatahash" xmlns:w16sdtfl="http://schemas.microsoft.com/office/word/2024/wordml/sdtformatlock" xmlns:w16se="http://schemas.microsoft.com/office/word/2015/wordml/symex" xmlns:wpg="http://schemas.microsoft.com/office/word/2010/wordprocessingGroup" xmlns:wpi="http://schemas.microsoft.com/office/word/2010/wordprocessingInk" xmlns:wne="http://schemas.microsoft.com/office/word/2006/wordml" xmlns:wps="http://schemas.microsoft.com/office/word/2010/wordprocessingShape" mc:Ignorable="w14 w15 w16se w16cid w16 w16cex w16sdtdh w16sdtfl w16du wp14">
+<w:document xmlns:wpc="http://schemas.microsoft.com/office/word/2010/wordprocessingCanvas" xmlns:cx="http://schemas.microsoft.com/office/drawing/2014/chartex" xmlns:cx1="http://schemas.microsoft.com/office/drawing/2015/9/8/chartex" xmlns:cx2="http://schemas.microsoft.com/office/drawing/2015/10/21/chartex" xmlns:cx3="http://schemas.microsoft.com/office/drawing/2016/5/9/chartex" xmlns:cx4="http://schemas.microsoft.com/office/drawing/2016/5/10/chartex" xmlns:cx5="http://schemas.microsoft.com/office/drawing/2016/5/11/chartex" xmlns:cx6="http://schemas.microsoft.com/office/drawing/2016/5/12/chartex" xmlns:cx7="http://schemas.microsoft.com/office/drawing/2016/5/13/chartex" xmlns:cx8="http://schemas.microsoft.com/office/drawing/2016/5/14/chartex" xmlns:mc="http://schemas.openxmlformats.org/markup-compatibility/2006" xmlns:aink="http://schemas.microsoft.com/office/drawing/2016/ink" xmlns:am3d="http://schemas.microsoft.com/office/drawing/2017/model3d" xmlns:o="urn:schemas-microsoft-com:office:office" xmlns:oel="http://schemas.microsoft.com/office/2019/extlst" xmlns:r="http://schemas.openxmlformats.org/officeDocument/2006/relationships" xmlns:m="http://schemas.openxmlformats.org/officeDocument/2006/math" xmlns:v="urn:schemas-microsoft-com:vml" xmlns:wp14="http://schemas.microsoft.com/office/word/2010/wordprocessingDrawing" xmlns:wp="http://schemas.openxmlformats.org/drawingml/2006/wordprocessingDrawing" xmlns:w10="urn:schemas-microsoft-com:office:word" xmlns:w="http://schemas.openxmlformats.org/wordprocessingml/2006/main" xmlns:w14="http://schemas.microsoft.com/office/word/2010/wordml" xmlns:w15="http://schemas.microsoft.com/office/word/2012/wordml" xmlns:w16cex="http://schemas.microsoft.com/office/word/2018/wordml/cex" xmlns:w16cid="http://schemas.microsoft.com/office/word/2016/wordml/cid" xmlns:w16="http://schemas.microsoft.com/office/word/2018/wordml" xmlns:w16sdtdh="http://schemas.microsoft.com/office/word/2020/wordml/sdtdatahash" xmlns:w16se="http://schemas.microsoft.com/office/word/2015/wordml/symex" xmlns:wpg="http://schemas.microsoft.com/office/word/2010/wordprocessingGroup" xmlns:wpi="http://schemas.microsoft.com/office/word/2010/wordprocessingInk" xmlns:wne="http://schemas.microsoft.com/office/word/2006/wordml" xmlns:wps="http://schemas.microsoft.com/office/word/2010/wordprocessingShape" mc:Ignorable="w14 w15 w16se w16cid w16 w16cex w16sdtdh wp14">
   <w:body>
     <w:tbl>
       <w:tblPr>
-        <w:tblStyle w:val="TableGrid"/>
+        <w:tblStyle w:val="a6"/>
         <w:tblW w:w="0" w:type="auto"/>
         <w:tblLook w:val="04A0" w:firstRow="1" w:lastRow="0" w:firstColumn="1" w:lastColumn="0" w:noHBand="0" w:noVBand="1"/>
       </w:tblPr>
@@ -135,7 +135,6 @@
             <w:r>
               <w:rPr>
                 <w:b/>
-                <w:lang w:val="ru-RU"/>
               </w:rPr>
               <w:t>ОРГАНІЗАЦІЯ БАЗ ДАНИХ</w:t>
             </w:r>
@@ -178,9 +177,6 @@
             <w:pPr>
               <w:spacing w:line="360" w:lineRule="auto"/>
               <w:jc w:val="center"/>
-              <w:rPr>
-                <w:lang w:val="ru-RU"/>
-              </w:rPr>
             </w:pPr>
             <w:r>
               <w:t xml:space="preserve">З </w:t>
@@ -195,9 +191,6 @@
               <w:t xml:space="preserve"> РОБОТИ № </w:t>
             </w:r>
             <w:r>
-              <w:rPr>
-                <w:lang w:val="ru-RU"/>
-              </w:rPr>
               <w:t>1</w:t>
             </w:r>
           </w:p>
@@ -251,9 +244,6 @@
               <w:t xml:space="preserve">студент групи </w:t>
             </w:r>
             <w:r>
-              <w:rPr>
-                <w:lang w:val="ru-RU"/>
-              </w:rPr>
               <w:t>КН-25-1</w:t>
             </w:r>
           </w:p>
@@ -261,8 +251,13 @@
             <w:pPr>
               <w:spacing w:line="360" w:lineRule="auto"/>
             </w:pPr>
-            <w:r>
-              <w:t>Рафієв Б. С.</w:t>
+            <w:proofErr w:type="spellStart"/>
+            <w:r>
+              <w:t>Рафієв</w:t>
+            </w:r>
+            <w:proofErr w:type="spellEnd"/>
+            <w:r>
+              <w:t xml:space="preserve"> Б. С.</w:t>
             </w:r>
           </w:p>
           <w:p>
@@ -290,30 +285,21 @@
               <w:rPr>
                 <w:noProof/>
               </w:rPr>
-              <w:t>доцент кафедри АІС</w:t>
-            </w:r>
-          </w:p>
-          <w:p>
-            <w:pPr>
-              <w:spacing w:line="360" w:lineRule="auto"/>
-            </w:pPr>
-            <w:r>
-              <w:rPr>
-                <w:lang w:val="ru-RU"/>
-              </w:rPr>
-              <w:t>Андреєв П</w:t>
-            </w:r>
-            <w:r>
-              <w:rPr>
-                <w:lang w:val="ru-RU"/>
-              </w:rPr>
-              <w:t>.</w:t>
-            </w:r>
-            <w:r>
-              <w:rPr>
-                <w:lang w:val="ru-RU"/>
-              </w:rPr>
-              <w:t>І.</w:t>
+              <w:t>асистент</w:t>
+            </w:r>
+            <w:r>
+              <w:rPr>
+                <w:noProof/>
+              </w:rPr>
+              <w:t xml:space="preserve"> кафедри АІС</w:t>
+            </w:r>
+          </w:p>
+          <w:p>
+            <w:pPr>
+              <w:spacing w:line="360" w:lineRule="auto"/>
+            </w:pPr>
+            <w:r>
+              <w:t>Андреєв П.І.</w:t>
             </w:r>
           </w:p>
         </w:tc>
@@ -448,7 +434,7 @@
                 <w:b/>
                 <w:bCs/>
                 <w:szCs w:val="28"/>
-                <w:lang w:val="en-US" w:eastAsia="uk-UA"/>
+                <w:lang w:eastAsia="uk-UA"/>
               </w:rPr>
             </w:pPr>
             <w:r>
@@ -459,7 +445,29 @@
                 <w:szCs w:val="28"/>
                 <w:lang w:eastAsia="uk-UA"/>
               </w:rPr>
-              <w:t>Концептуальне проєктування предметної галузі</w:t>
+              <w:t xml:space="preserve">Концептуальне </w:t>
+            </w:r>
+            <w:proofErr w:type="spellStart"/>
+            <w:r>
+              <w:rPr>
+                <w:rFonts w:eastAsia="Times New Roman" w:cs="Times New Roman"/>
+                <w:b/>
+                <w:bCs/>
+                <w:szCs w:val="28"/>
+                <w:lang w:eastAsia="uk-UA"/>
+              </w:rPr>
+              <w:t>проєктування</w:t>
+            </w:r>
+            <w:proofErr w:type="spellEnd"/>
+            <w:r>
+              <w:rPr>
+                <w:rFonts w:eastAsia="Times New Roman" w:cs="Times New Roman"/>
+                <w:b/>
+                <w:bCs/>
+                <w:szCs w:val="28"/>
+                <w:lang w:eastAsia="uk-UA"/>
+              </w:rPr>
+              <w:t xml:space="preserve"> предметної галузі</w:t>
             </w:r>
           </w:p>
         </w:tc>
@@ -542,7 +550,7 @@
     </w:p>
     <w:p>
       <w:pPr>
-        <w:pStyle w:val="ListParagraph"/>
+        <w:pStyle w:val="a7"/>
         <w:numPr>
           <w:ilvl w:val="0"/>
           <w:numId w:val="11"/>
@@ -561,12 +569,17 @@
         <w:spacing w:after="0" w:line="360" w:lineRule="auto"/>
         <w:ind w:firstLine="720"/>
         <w:jc w:val="both"/>
-        <w:rPr>
-          <w:lang w:val="ru-RU"/>
-        </w:rPr>
       </w:pPr>
       <w:r>
-        <w:t>Відповідно до опису предметної області «Деканат ВНЗ» та ER-діаграми (рис. 1.2 навчального посібника), для визначених сутностей було встановлено назви зв'язків та їх кратність:</w:t>
+        <w:t xml:space="preserve">Відповідно до опису предметної області «Деканат ВНЗ» та ER-діаграми (рис. 1.2 навчального посібника), для визначених сутностей було встановлено назви </w:t>
+      </w:r>
+      <w:proofErr w:type="spellStart"/>
+      <w:r>
+        <w:t>зв'язків</w:t>
+      </w:r>
+      <w:proofErr w:type="spellEnd"/>
+      <w:r>
+        <w:t xml:space="preserve"> та їх кратність:</w:t>
       </w:r>
     </w:p>
     <w:p>
@@ -574,9 +587,6 @@
         <w:spacing w:after="120" w:line="360" w:lineRule="auto"/>
         <w:ind w:firstLine="720"/>
         <w:jc w:val="both"/>
-        <w:rPr>
-          <w:lang w:val="ru-RU"/>
-        </w:rPr>
       </w:pPr>
     </w:p>
     <w:p>
@@ -651,7 +661,7 @@
     </w:p>
     <w:p>
       <w:pPr>
-        <w:pStyle w:val="ListParagraph"/>
+        <w:pStyle w:val="a7"/>
         <w:numPr>
           <w:ilvl w:val="0"/>
           <w:numId w:val="11"/>
@@ -668,7 +678,23 @@
           <w:szCs w:val="28"/>
         </w:rPr>
         <w:lastRenderedPageBreak/>
-        <w:t>Концептуальне проєктування 5 предметних областей</w:t>
+        <w:t xml:space="preserve">Концептуальне </w:t>
+      </w:r>
+      <w:proofErr w:type="spellStart"/>
+      <w:r>
+        <w:rPr>
+          <w:b/>
+          <w:szCs w:val="28"/>
+        </w:rPr>
+        <w:t>проєктування</w:t>
+      </w:r>
+      <w:proofErr w:type="spellEnd"/>
+      <w:r>
+        <w:rPr>
+          <w:b/>
+          <w:szCs w:val="28"/>
+        </w:rPr>
+        <w:t xml:space="preserve"> 5 предметних областей</w:t>
       </w:r>
     </w:p>
     <w:p>
@@ -703,7 +729,6 @@
         <w:rPr>
           <w:bCs/>
           <w:szCs w:val="28"/>
-          <w:lang w:val="ru-RU"/>
         </w:rPr>
       </w:pPr>
       <w:r>
@@ -721,7 +746,6 @@
         <w:rPr>
           <w:bCs/>
           <w:szCs w:val="28"/>
-          <w:lang w:val="ru-RU"/>
         </w:rPr>
       </w:pPr>
       <w:r>
@@ -739,7 +763,6 @@
         <w:rPr>
           <w:bCs/>
           <w:szCs w:val="28"/>
-          <w:lang w:val="ru-RU"/>
         </w:rPr>
       </w:pPr>
     </w:p>
@@ -818,7 +841,6 @@
         <w:rPr>
           <w:bCs/>
           <w:szCs w:val="28"/>
-          <w:lang w:val="ru-RU"/>
         </w:rPr>
       </w:pPr>
     </w:p>
@@ -1487,8 +1509,17 @@
           <w:bCs/>
           <w:szCs w:val="28"/>
         </w:rPr>
-        <w:t>Таблиця 1.2 – Структура таблиці Book</w:t>
+        <w:t xml:space="preserve">Таблиця 1.2 – Структура таблиці </w:t>
       </w:r>
+      <w:proofErr w:type="spellStart"/>
+      <w:r>
+        <w:rPr>
+          <w:bCs/>
+          <w:szCs w:val="28"/>
+        </w:rPr>
+        <w:t>Book</w:t>
+      </w:r>
+      <w:proofErr w:type="spellEnd"/>
     </w:p>
     <w:tbl>
       <w:tblPr>
@@ -1675,6 +1706,7 @@
                 <w:szCs w:val="28"/>
               </w:rPr>
             </w:pPr>
+            <w:proofErr w:type="spellStart"/>
             <w:r>
               <w:rPr>
                 <w:bCs/>
@@ -1682,6 +1714,7 @@
               </w:rPr>
               <w:t>id_book</w:t>
             </w:r>
+            <w:proofErr w:type="spellEnd"/>
           </w:p>
         </w:tc>
         <w:tc>
@@ -1789,6 +1822,7 @@
                 <w:szCs w:val="28"/>
               </w:rPr>
             </w:pPr>
+            <w:proofErr w:type="spellStart"/>
             <w:r>
               <w:rPr>
                 <w:bCs/>
@@ -1796,6 +1830,7 @@
               </w:rPr>
               <w:t>title</w:t>
             </w:r>
+            <w:proofErr w:type="spellEnd"/>
           </w:p>
         </w:tc>
         <w:tc>
@@ -1903,6 +1938,7 @@
                 <w:szCs w:val="28"/>
               </w:rPr>
             </w:pPr>
+            <w:proofErr w:type="spellStart"/>
             <w:r>
               <w:rPr>
                 <w:bCs/>
@@ -1910,6 +1946,7 @@
               </w:rPr>
               <w:t>id_author</w:t>
             </w:r>
+            <w:proofErr w:type="spellEnd"/>
           </w:p>
         </w:tc>
         <w:tc>
@@ -2017,6 +2054,7 @@
                 <w:szCs w:val="28"/>
               </w:rPr>
             </w:pPr>
+            <w:proofErr w:type="spellStart"/>
             <w:r>
               <w:rPr>
                 <w:bCs/>
@@ -2024,6 +2062,7 @@
               </w:rPr>
               <w:t>id_publisher</w:t>
             </w:r>
+            <w:proofErr w:type="spellEnd"/>
           </w:p>
         </w:tc>
         <w:tc>
@@ -2131,6 +2170,7 @@
                 <w:szCs w:val="28"/>
               </w:rPr>
             </w:pPr>
+            <w:proofErr w:type="spellStart"/>
             <w:r>
               <w:rPr>
                 <w:bCs/>
@@ -2138,6 +2178,7 @@
               </w:rPr>
               <w:t>year_pub</w:t>
             </w:r>
+            <w:proofErr w:type="spellEnd"/>
           </w:p>
         </w:tc>
         <w:tc>
@@ -2245,6 +2286,7 @@
                 <w:szCs w:val="28"/>
               </w:rPr>
             </w:pPr>
+            <w:proofErr w:type="spellStart"/>
             <w:r>
               <w:rPr>
                 <w:bCs/>
@@ -2252,6 +2294,7 @@
               </w:rPr>
               <w:t>pages</w:t>
             </w:r>
+            <w:proofErr w:type="spellEnd"/>
           </w:p>
         </w:tc>
         <w:tc>
@@ -2351,7 +2394,6 @@
         <w:rPr>
           <w:bCs/>
           <w:szCs w:val="28"/>
-          <w:lang w:val="ru-RU"/>
         </w:rPr>
       </w:pPr>
       <w:r>
@@ -2369,7 +2411,6 @@
         <w:rPr>
           <w:bCs/>
           <w:szCs w:val="28"/>
-          <w:lang w:val="ru-RU"/>
         </w:rPr>
       </w:pPr>
       <w:r>
@@ -2455,7 +2496,6 @@
         <w:rPr>
           <w:bCs/>
           <w:szCs w:val="28"/>
-          <w:lang w:val="ru-RU"/>
         </w:rPr>
       </w:pPr>
     </w:p>
@@ -3038,8 +3078,17 @@
           <w:bCs/>
           <w:szCs w:val="28"/>
         </w:rPr>
-        <w:t>Таблиця 2.2 – Структура таблиці Product</w:t>
+        <w:t xml:space="preserve">Таблиця 2.2 – Структура таблиці </w:t>
       </w:r>
+      <w:proofErr w:type="spellStart"/>
+      <w:r>
+        <w:rPr>
+          <w:bCs/>
+          <w:szCs w:val="28"/>
+        </w:rPr>
+        <w:t>Product</w:t>
+      </w:r>
+      <w:proofErr w:type="spellEnd"/>
     </w:p>
     <w:tbl>
       <w:tblPr>
@@ -3225,6 +3274,7 @@
                 <w:szCs w:val="28"/>
               </w:rPr>
             </w:pPr>
+            <w:proofErr w:type="spellStart"/>
             <w:r>
               <w:rPr>
                 <w:bCs/>
@@ -3232,6 +3282,7 @@
               </w:rPr>
               <w:t>id_product</w:t>
             </w:r>
+            <w:proofErr w:type="spellEnd"/>
           </w:p>
         </w:tc>
         <w:tc>
@@ -3339,6 +3390,7 @@
                 <w:szCs w:val="28"/>
               </w:rPr>
             </w:pPr>
+            <w:proofErr w:type="spellStart"/>
             <w:r>
               <w:rPr>
                 <w:bCs/>
@@ -3346,6 +3398,7 @@
               </w:rPr>
               <w:t>product_name</w:t>
             </w:r>
+            <w:proofErr w:type="spellEnd"/>
           </w:p>
         </w:tc>
         <w:tc>
@@ -3453,6 +3506,7 @@
                 <w:szCs w:val="28"/>
               </w:rPr>
             </w:pPr>
+            <w:proofErr w:type="spellStart"/>
             <w:r>
               <w:rPr>
                 <w:bCs/>
@@ -3460,6 +3514,7 @@
               </w:rPr>
               <w:t>price</w:t>
             </w:r>
+            <w:proofErr w:type="spellEnd"/>
           </w:p>
         </w:tc>
         <w:tc>
@@ -3567,6 +3622,7 @@
                 <w:szCs w:val="28"/>
               </w:rPr>
             </w:pPr>
+            <w:proofErr w:type="spellStart"/>
             <w:r>
               <w:rPr>
                 <w:bCs/>
@@ -3574,6 +3630,7 @@
               </w:rPr>
               <w:t>stock_qty</w:t>
             </w:r>
+            <w:proofErr w:type="spellEnd"/>
           </w:p>
         </w:tc>
         <w:tc>
@@ -3681,6 +3738,7 @@
                 <w:szCs w:val="28"/>
               </w:rPr>
             </w:pPr>
+            <w:proofErr w:type="spellStart"/>
             <w:r>
               <w:rPr>
                 <w:bCs/>
@@ -3688,6 +3746,7 @@
               </w:rPr>
               <w:t>id_category</w:t>
             </w:r>
+            <w:proofErr w:type="spellEnd"/>
           </w:p>
         </w:tc>
         <w:tc>
@@ -3787,7 +3846,6 @@
         <w:rPr>
           <w:bCs/>
           <w:szCs w:val="28"/>
-          <w:lang w:val="ru-RU"/>
         </w:rPr>
       </w:pPr>
       <w:r>
@@ -3805,7 +3863,6 @@
         <w:rPr>
           <w:bCs/>
           <w:szCs w:val="28"/>
-          <w:lang w:val="ru-RU"/>
         </w:rPr>
       </w:pPr>
       <w:r>
@@ -3823,7 +3880,6 @@
         <w:rPr>
           <w:bCs/>
           <w:szCs w:val="28"/>
-          <w:lang w:val="ru-RU"/>
         </w:rPr>
       </w:pPr>
     </w:p>
@@ -3902,7 +3958,6 @@
         <w:rPr>
           <w:bCs/>
           <w:szCs w:val="28"/>
-          <w:lang w:val="ru-RU"/>
         </w:rPr>
       </w:pPr>
     </w:p>
@@ -4572,8 +4627,17 @@
           <w:bCs/>
           <w:szCs w:val="28"/>
         </w:rPr>
-        <w:t>Таблиця 3.2 – Структура таблиці Car</w:t>
+        <w:t xml:space="preserve">Таблиця 3.2 – Структура таблиці </w:t>
       </w:r>
+      <w:proofErr w:type="spellStart"/>
+      <w:r>
+        <w:rPr>
+          <w:bCs/>
+          <w:szCs w:val="28"/>
+        </w:rPr>
+        <w:t>Car</w:t>
+      </w:r>
+      <w:proofErr w:type="spellEnd"/>
     </w:p>
     <w:tbl>
       <w:tblPr>
@@ -4759,6 +4823,7 @@
                 <w:szCs w:val="28"/>
               </w:rPr>
             </w:pPr>
+            <w:proofErr w:type="spellStart"/>
             <w:r>
               <w:rPr>
                 <w:bCs/>
@@ -4766,6 +4831,7 @@
               </w:rPr>
               <w:t>id_car</w:t>
             </w:r>
+            <w:proofErr w:type="spellEnd"/>
           </w:p>
         </w:tc>
         <w:tc>
@@ -4873,6 +4939,7 @@
                 <w:szCs w:val="28"/>
               </w:rPr>
             </w:pPr>
+            <w:proofErr w:type="spellStart"/>
             <w:r>
               <w:rPr>
                 <w:bCs/>
@@ -4880,6 +4947,7 @@
               </w:rPr>
               <w:t>vin_code</w:t>
             </w:r>
+            <w:proofErr w:type="spellEnd"/>
           </w:p>
         </w:tc>
         <w:tc>
@@ -4987,6 +5055,7 @@
                 <w:szCs w:val="28"/>
               </w:rPr>
             </w:pPr>
+            <w:proofErr w:type="spellStart"/>
             <w:r>
               <w:rPr>
                 <w:bCs/>
@@ -4994,6 +5063,7 @@
               </w:rPr>
               <w:t>brand</w:t>
             </w:r>
+            <w:proofErr w:type="spellEnd"/>
           </w:p>
         </w:tc>
         <w:tc>
@@ -5101,6 +5171,7 @@
                 <w:szCs w:val="28"/>
               </w:rPr>
             </w:pPr>
+            <w:proofErr w:type="spellStart"/>
             <w:r>
               <w:rPr>
                 <w:bCs/>
@@ -5108,6 +5179,7 @@
               </w:rPr>
               <w:t>model</w:t>
             </w:r>
+            <w:proofErr w:type="spellEnd"/>
           </w:p>
         </w:tc>
         <w:tc>
@@ -5215,6 +5287,7 @@
                 <w:szCs w:val="28"/>
               </w:rPr>
             </w:pPr>
+            <w:proofErr w:type="spellStart"/>
             <w:r>
               <w:rPr>
                 <w:bCs/>
@@ -5222,6 +5295,7 @@
               </w:rPr>
               <w:t>year</w:t>
             </w:r>
+            <w:proofErr w:type="spellEnd"/>
           </w:p>
         </w:tc>
         <w:tc>
@@ -5329,6 +5403,7 @@
                 <w:szCs w:val="28"/>
               </w:rPr>
             </w:pPr>
+            <w:proofErr w:type="spellStart"/>
             <w:r>
               <w:rPr>
                 <w:bCs/>
@@ -5336,6 +5411,7 @@
               </w:rPr>
               <w:t>id_client</w:t>
             </w:r>
+            <w:proofErr w:type="spellEnd"/>
           </w:p>
         </w:tc>
         <w:tc>
@@ -5434,7 +5510,6 @@
         <w:rPr>
           <w:bCs/>
           <w:szCs w:val="28"/>
-          <w:lang w:val="ru-RU"/>
         </w:rPr>
       </w:pPr>
       <w:r>
@@ -5451,7 +5526,6 @@
         <w:rPr>
           <w:bCs/>
           <w:szCs w:val="28"/>
-          <w:lang w:val="ru-RU"/>
         </w:rPr>
       </w:pPr>
       <w:r>
@@ -5469,7 +5543,6 @@
         <w:rPr>
           <w:bCs/>
           <w:szCs w:val="28"/>
-          <w:lang w:val="ru-RU"/>
         </w:rPr>
       </w:pPr>
     </w:p>
@@ -5532,7 +5605,6 @@
         <w:rPr>
           <w:bCs/>
           <w:szCs w:val="28"/>
-          <w:lang w:val="ru-RU"/>
         </w:rPr>
       </w:pPr>
       <w:r>
@@ -5549,7 +5621,6 @@
         <w:rPr>
           <w:bCs/>
           <w:szCs w:val="28"/>
-          <w:lang w:val="ru-RU"/>
         </w:rPr>
       </w:pPr>
     </w:p>
@@ -6218,8 +6289,17 @@
           <w:bCs/>
           <w:szCs w:val="28"/>
         </w:rPr>
-        <w:t>Таблиця 4.2 – Структура таблиці Booking</w:t>
+        <w:t xml:space="preserve">Таблиця 4.2 – Структура таблиці </w:t>
       </w:r>
+      <w:proofErr w:type="spellStart"/>
+      <w:r>
+        <w:rPr>
+          <w:bCs/>
+          <w:szCs w:val="28"/>
+        </w:rPr>
+        <w:t>Booking</w:t>
+      </w:r>
+      <w:proofErr w:type="spellEnd"/>
     </w:p>
     <w:tbl>
       <w:tblPr>
@@ -6405,6 +6485,7 @@
                 <w:szCs w:val="28"/>
               </w:rPr>
             </w:pPr>
+            <w:proofErr w:type="spellStart"/>
             <w:r>
               <w:rPr>
                 <w:bCs/>
@@ -6412,6 +6493,7 @@
               </w:rPr>
               <w:t>id_booking</w:t>
             </w:r>
+            <w:proofErr w:type="spellEnd"/>
           </w:p>
         </w:tc>
         <w:tc>
@@ -6519,6 +6601,7 @@
                 <w:szCs w:val="28"/>
               </w:rPr>
             </w:pPr>
+            <w:proofErr w:type="spellStart"/>
             <w:r>
               <w:rPr>
                 <w:bCs/>
@@ -6526,6 +6609,7 @@
               </w:rPr>
               <w:t>id_guest</w:t>
             </w:r>
+            <w:proofErr w:type="spellEnd"/>
           </w:p>
         </w:tc>
         <w:tc>
@@ -6633,6 +6717,7 @@
                 <w:szCs w:val="28"/>
               </w:rPr>
             </w:pPr>
+            <w:proofErr w:type="spellStart"/>
             <w:r>
               <w:rPr>
                 <w:bCs/>
@@ -6640,6 +6725,7 @@
               </w:rPr>
               <w:t>id_room</w:t>
             </w:r>
+            <w:proofErr w:type="spellEnd"/>
           </w:p>
         </w:tc>
         <w:tc>
@@ -6747,6 +6833,7 @@
                 <w:szCs w:val="28"/>
               </w:rPr>
             </w:pPr>
+            <w:proofErr w:type="spellStart"/>
             <w:r>
               <w:rPr>
                 <w:bCs/>
@@ -6754,6 +6841,7 @@
               </w:rPr>
               <w:t>check_in</w:t>
             </w:r>
+            <w:proofErr w:type="spellEnd"/>
           </w:p>
         </w:tc>
         <w:tc>
@@ -6862,6 +6950,7 @@
                 <w:szCs w:val="28"/>
               </w:rPr>
             </w:pPr>
+            <w:proofErr w:type="spellStart"/>
             <w:r>
               <w:rPr>
                 <w:bCs/>
@@ -6869,6 +6958,7 @@
               </w:rPr>
               <w:t>check_out</w:t>
             </w:r>
+            <w:proofErr w:type="spellEnd"/>
           </w:p>
         </w:tc>
         <w:tc>
@@ -6976,6 +7066,7 @@
                 <w:szCs w:val="28"/>
               </w:rPr>
             </w:pPr>
+            <w:proofErr w:type="spellStart"/>
             <w:r>
               <w:rPr>
                 <w:bCs/>
@@ -6983,6 +7074,7 @@
               </w:rPr>
               <w:t>total_price</w:t>
             </w:r>
+            <w:proofErr w:type="spellEnd"/>
           </w:p>
         </w:tc>
         <w:tc>
@@ -7082,7 +7174,6 @@
         <w:rPr>
           <w:bCs/>
           <w:szCs w:val="28"/>
-          <w:lang w:val="ru-RU"/>
         </w:rPr>
       </w:pPr>
       <w:r>
@@ -7100,7 +7191,6 @@
         <w:rPr>
           <w:bCs/>
           <w:szCs w:val="28"/>
-          <w:lang w:val="ru-RU"/>
         </w:rPr>
       </w:pPr>
       <w:r>
@@ -7118,7 +7208,6 @@
         <w:rPr>
           <w:bCs/>
           <w:szCs w:val="28"/>
-          <w:lang w:val="ru-RU"/>
         </w:rPr>
       </w:pPr>
     </w:p>
@@ -7197,7 +7286,6 @@
         <w:rPr>
           <w:bCs/>
           <w:szCs w:val="28"/>
-          <w:lang w:val="ru-RU"/>
         </w:rPr>
       </w:pPr>
     </w:p>
@@ -8054,6 +8142,7 @@
                 <w:szCs w:val="28"/>
               </w:rPr>
             </w:pPr>
+            <w:proofErr w:type="spellStart"/>
             <w:r>
               <w:rPr>
                 <w:bCs/>
@@ -8061,6 +8150,7 @@
               </w:rPr>
               <w:t>id_schedule</w:t>
             </w:r>
+            <w:proofErr w:type="spellEnd"/>
           </w:p>
         </w:tc>
         <w:tc>
@@ -8168,6 +8258,7 @@
                 <w:szCs w:val="28"/>
               </w:rPr>
             </w:pPr>
+            <w:proofErr w:type="spellStart"/>
             <w:r>
               <w:rPr>
                 <w:bCs/>
@@ -8175,6 +8266,7 @@
               </w:rPr>
               <w:t>day_of_week</w:t>
             </w:r>
+            <w:proofErr w:type="spellEnd"/>
           </w:p>
         </w:tc>
         <w:tc>
@@ -8282,6 +8374,7 @@
                 <w:szCs w:val="28"/>
               </w:rPr>
             </w:pPr>
+            <w:proofErr w:type="spellStart"/>
             <w:r>
               <w:rPr>
                 <w:bCs/>
@@ -8289,6 +8382,7 @@
               </w:rPr>
               <w:t>lesson_number</w:t>
             </w:r>
+            <w:proofErr w:type="spellEnd"/>
           </w:p>
         </w:tc>
         <w:tc>
@@ -8396,6 +8490,7 @@
                 <w:szCs w:val="28"/>
               </w:rPr>
             </w:pPr>
+            <w:proofErr w:type="spellStart"/>
             <w:r>
               <w:rPr>
                 <w:bCs/>
@@ -8403,6 +8498,7 @@
               </w:rPr>
               <w:t>id_room</w:t>
             </w:r>
+            <w:proofErr w:type="spellEnd"/>
           </w:p>
         </w:tc>
         <w:tc>
@@ -8510,6 +8606,7 @@
                 <w:szCs w:val="28"/>
               </w:rPr>
             </w:pPr>
+            <w:proofErr w:type="spellStart"/>
             <w:r>
               <w:rPr>
                 <w:bCs/>
@@ -8517,6 +8614,7 @@
               </w:rPr>
               <w:t>id_subject</w:t>
             </w:r>
+            <w:proofErr w:type="spellEnd"/>
           </w:p>
         </w:tc>
         <w:tc>
@@ -8624,6 +8722,7 @@
                 <w:szCs w:val="28"/>
               </w:rPr>
             </w:pPr>
+            <w:proofErr w:type="spellStart"/>
             <w:r>
               <w:rPr>
                 <w:bCs/>
@@ -8631,6 +8730,7 @@
               </w:rPr>
               <w:t>id_group</w:t>
             </w:r>
+            <w:proofErr w:type="spellEnd"/>
           </w:p>
         </w:tc>
         <w:tc>
@@ -8697,19 +8797,1036 @@
           <w:rFonts w:eastAsia="Times New Roman" w:cs="Times New Roman"/>
           <w:bCs/>
           <w:szCs w:val="28"/>
-          <w:lang w:val="ru-RU" w:eastAsia="uk-UA"/>
+          <w:lang w:eastAsia="uk-UA"/>
         </w:rPr>
       </w:pPr>
     </w:p>
     <w:p>
       <w:pPr>
+        <w:pStyle w:val="a7"/>
+        <w:numPr>
+          <w:ilvl w:val="0"/>
+          <w:numId w:val="11"/>
+        </w:numPr>
+        <w:tabs>
+          <w:tab w:val="left" w:pos="1134"/>
+        </w:tabs>
+        <w:spacing w:after="0" w:line="360" w:lineRule="auto"/>
+        <w:ind w:left="0" w:firstLine="709"/>
+        <w:rPr>
+          <w:rFonts w:eastAsia="Times New Roman" w:cs="Times New Roman"/>
+          <w:b/>
+          <w:szCs w:val="28"/>
+          <w:lang w:eastAsia="uk-UA"/>
+        </w:rPr>
+      </w:pPr>
+      <w:r>
+        <w:rPr>
+          <w:rFonts w:eastAsia="Times New Roman" w:cs="Times New Roman"/>
+          <w:b/>
+          <w:szCs w:val="28"/>
+          <w:lang w:eastAsia="uk-UA"/>
+        </w:rPr>
+        <w:t>Відповіді на контрольні питання</w:t>
+      </w:r>
+    </w:p>
+    <w:p>
+      <w:pPr>
+        <w:pStyle w:val="a7"/>
+        <w:numPr>
+          <w:ilvl w:val="0"/>
+          <w:numId w:val="12"/>
+        </w:numPr>
+        <w:tabs>
+          <w:tab w:val="left" w:pos="1276"/>
+        </w:tabs>
+        <w:spacing w:after="0" w:line="360" w:lineRule="auto"/>
+        <w:ind w:left="0" w:firstLine="851"/>
+        <w:rPr>
+          <w:rFonts w:eastAsia="Times New Roman" w:cs="Times New Roman"/>
+          <w:bCs/>
+          <w:szCs w:val="28"/>
+          <w:lang w:eastAsia="uk-UA"/>
+        </w:rPr>
+      </w:pPr>
+      <w:r>
+        <w:rPr>
+          <w:rFonts w:eastAsia="Times New Roman" w:cs="Times New Roman"/>
+          <w:bCs/>
+          <w:szCs w:val="28"/>
+          <w:lang w:eastAsia="uk-UA"/>
+        </w:rPr>
+        <w:t xml:space="preserve">Етапи </w:t>
+      </w:r>
+      <w:proofErr w:type="spellStart"/>
+      <w:r>
+        <w:rPr>
+          <w:rFonts w:eastAsia="Times New Roman" w:cs="Times New Roman"/>
+          <w:bCs/>
+          <w:szCs w:val="28"/>
+          <w:lang w:eastAsia="uk-UA"/>
+        </w:rPr>
+        <w:t>проєктування</w:t>
+      </w:r>
+      <w:proofErr w:type="spellEnd"/>
+      <w:r>
+        <w:rPr>
+          <w:rFonts w:eastAsia="Times New Roman" w:cs="Times New Roman"/>
+          <w:bCs/>
+          <w:szCs w:val="28"/>
+          <w:lang w:eastAsia="uk-UA"/>
+        </w:rPr>
+        <w:t xml:space="preserve"> БД:</w:t>
+      </w:r>
+    </w:p>
+    <w:p>
+      <w:pPr>
+        <w:pStyle w:val="a7"/>
+        <w:numPr>
+          <w:ilvl w:val="0"/>
+          <w:numId w:val="13"/>
+        </w:numPr>
+        <w:tabs>
+          <w:tab w:val="left" w:pos="1134"/>
+        </w:tabs>
+        <w:spacing w:after="0" w:line="360" w:lineRule="auto"/>
+        <w:rPr>
+          <w:rFonts w:eastAsia="Times New Roman" w:cs="Times New Roman"/>
+          <w:bCs/>
+          <w:szCs w:val="28"/>
+          <w:lang w:eastAsia="uk-UA"/>
+        </w:rPr>
+      </w:pPr>
+      <w:r>
+        <w:rPr>
+          <w:rFonts w:eastAsia="Times New Roman" w:cs="Times New Roman"/>
+          <w:bCs/>
+          <w:szCs w:val="28"/>
+          <w:lang w:eastAsia="uk-UA"/>
+        </w:rPr>
+        <w:t xml:space="preserve">Концептуальне </w:t>
+      </w:r>
+      <w:proofErr w:type="spellStart"/>
+      <w:r>
+        <w:rPr>
+          <w:rFonts w:eastAsia="Times New Roman" w:cs="Times New Roman"/>
+          <w:bCs/>
+          <w:szCs w:val="28"/>
+          <w:lang w:eastAsia="uk-UA"/>
+        </w:rPr>
+        <w:t>проєктування</w:t>
+      </w:r>
+      <w:proofErr w:type="spellEnd"/>
+      <w:r>
+        <w:rPr>
+          <w:rFonts w:eastAsia="Times New Roman" w:cs="Times New Roman"/>
+          <w:bCs/>
+          <w:szCs w:val="28"/>
+          <w:lang w:eastAsia="uk-UA"/>
+        </w:rPr>
+        <w:t xml:space="preserve">: аналіз вимог, виділення сутностей, атрибутів та </w:t>
+      </w:r>
+      <w:proofErr w:type="spellStart"/>
+      <w:r>
+        <w:rPr>
+          <w:rFonts w:eastAsia="Times New Roman" w:cs="Times New Roman"/>
+          <w:bCs/>
+          <w:szCs w:val="28"/>
+          <w:lang w:eastAsia="uk-UA"/>
+        </w:rPr>
+        <w:t>зв'язків</w:t>
+      </w:r>
+      <w:proofErr w:type="spellEnd"/>
+      <w:r>
+        <w:rPr>
+          <w:rFonts w:eastAsia="Times New Roman" w:cs="Times New Roman"/>
+          <w:bCs/>
+          <w:szCs w:val="28"/>
+          <w:lang w:eastAsia="uk-UA"/>
+        </w:rPr>
+        <w:t xml:space="preserve"> між ними (ER-діаграми).   </w:t>
+      </w:r>
+    </w:p>
+    <w:p>
+      <w:pPr>
+        <w:pStyle w:val="a7"/>
+        <w:numPr>
+          <w:ilvl w:val="0"/>
+          <w:numId w:val="13"/>
+        </w:numPr>
+        <w:tabs>
+          <w:tab w:val="left" w:pos="1134"/>
+        </w:tabs>
+        <w:spacing w:after="0" w:line="360" w:lineRule="auto"/>
+        <w:rPr>
+          <w:rFonts w:eastAsia="Times New Roman" w:cs="Times New Roman"/>
+          <w:bCs/>
+          <w:szCs w:val="28"/>
+          <w:lang w:eastAsia="uk-UA"/>
+        </w:rPr>
+      </w:pPr>
+      <w:r>
+        <w:rPr>
+          <w:rFonts w:eastAsia="Times New Roman" w:cs="Times New Roman"/>
+          <w:bCs/>
+          <w:szCs w:val="28"/>
+          <w:lang w:eastAsia="uk-UA"/>
+        </w:rPr>
+        <w:t xml:space="preserve">Логічне </w:t>
+      </w:r>
+      <w:proofErr w:type="spellStart"/>
+      <w:r>
+        <w:rPr>
+          <w:rFonts w:eastAsia="Times New Roman" w:cs="Times New Roman"/>
+          <w:bCs/>
+          <w:szCs w:val="28"/>
+          <w:lang w:eastAsia="uk-UA"/>
+        </w:rPr>
+        <w:t>проєктування</w:t>
+      </w:r>
+      <w:proofErr w:type="spellEnd"/>
+      <w:r>
+        <w:rPr>
+          <w:rFonts w:eastAsia="Times New Roman" w:cs="Times New Roman"/>
+          <w:bCs/>
+          <w:szCs w:val="28"/>
+          <w:lang w:eastAsia="uk-UA"/>
+        </w:rPr>
+        <w:t>: вибір моделі даних (наприклад, реляційної), нормалізація таблиць, визначення первинних/зовнішніх ключів.</w:t>
+      </w:r>
+    </w:p>
+    <w:p>
+      <w:pPr>
+        <w:pStyle w:val="a7"/>
+        <w:numPr>
+          <w:ilvl w:val="0"/>
+          <w:numId w:val="13"/>
+        </w:numPr>
+        <w:tabs>
+          <w:tab w:val="left" w:pos="1134"/>
+        </w:tabs>
+        <w:spacing w:after="0" w:line="360" w:lineRule="auto"/>
+        <w:rPr>
+          <w:rFonts w:eastAsia="Times New Roman" w:cs="Times New Roman"/>
+          <w:bCs/>
+          <w:szCs w:val="28"/>
+          <w:lang w:eastAsia="uk-UA"/>
+        </w:rPr>
+      </w:pPr>
+      <w:r>
+        <w:rPr>
+          <w:rFonts w:eastAsia="Times New Roman" w:cs="Times New Roman"/>
+          <w:bCs/>
+          <w:szCs w:val="28"/>
+          <w:lang w:eastAsia="uk-UA"/>
+        </w:rPr>
+        <w:t xml:space="preserve">Фізичне </w:t>
+      </w:r>
+      <w:proofErr w:type="spellStart"/>
+      <w:r>
+        <w:rPr>
+          <w:rFonts w:eastAsia="Times New Roman" w:cs="Times New Roman"/>
+          <w:bCs/>
+          <w:szCs w:val="28"/>
+          <w:lang w:eastAsia="uk-UA"/>
+        </w:rPr>
+        <w:t>проєктування</w:t>
+      </w:r>
+      <w:proofErr w:type="spellEnd"/>
+      <w:r>
+        <w:rPr>
+          <w:rFonts w:eastAsia="Times New Roman" w:cs="Times New Roman"/>
+          <w:bCs/>
+          <w:szCs w:val="28"/>
+          <w:lang w:eastAsia="uk-UA"/>
+        </w:rPr>
+        <w:t>: вибір СУБД, створення структури таблиць, визначення конкретних типів даних, індексів та обмежень у СУБД.</w:t>
+      </w:r>
+    </w:p>
+    <w:p>
+      <w:pPr>
+        <w:pStyle w:val="a7"/>
+        <w:numPr>
+          <w:ilvl w:val="0"/>
+          <w:numId w:val="12"/>
+        </w:numPr>
+        <w:tabs>
+          <w:tab w:val="left" w:pos="1276"/>
+        </w:tabs>
+        <w:spacing w:after="0" w:line="360" w:lineRule="auto"/>
+        <w:ind w:left="0" w:firstLine="851"/>
+        <w:rPr>
+          <w:rFonts w:eastAsia="Times New Roman" w:cs="Times New Roman"/>
+          <w:bCs/>
+          <w:szCs w:val="28"/>
+          <w:lang w:eastAsia="uk-UA"/>
+        </w:rPr>
+      </w:pPr>
+      <w:r>
+        <w:rPr>
+          <w:rFonts w:eastAsia="Times New Roman" w:cs="Times New Roman"/>
+          <w:bCs/>
+          <w:szCs w:val="28"/>
+          <w:lang w:eastAsia="uk-UA"/>
+        </w:rPr>
+        <w:t>Співвідношення поняття «сутність» та «зв’язок»:</w:t>
+      </w:r>
+    </w:p>
+    <w:p>
+      <w:pPr>
+        <w:pStyle w:val="a7"/>
+        <w:numPr>
+          <w:ilvl w:val="0"/>
+          <w:numId w:val="14"/>
+        </w:numPr>
+        <w:tabs>
+          <w:tab w:val="left" w:pos="1134"/>
+        </w:tabs>
+        <w:spacing w:after="0" w:line="360" w:lineRule="auto"/>
+        <w:rPr>
+          <w:rFonts w:eastAsia="Times New Roman" w:cs="Times New Roman"/>
+          <w:bCs/>
+          <w:szCs w:val="28"/>
+          <w:lang w:eastAsia="uk-UA"/>
+        </w:rPr>
+      </w:pPr>
+      <w:r>
+        <w:rPr>
+          <w:rFonts w:eastAsia="Times New Roman" w:cs="Times New Roman"/>
+          <w:bCs/>
+          <w:szCs w:val="28"/>
+          <w:lang w:eastAsia="uk-UA"/>
+        </w:rPr>
+        <w:t>Сутність – це реальний чи уявний об'єкт предметної області (наприклад, «Студент», «Книга»).</w:t>
+      </w:r>
+    </w:p>
+    <w:p>
+      <w:pPr>
+        <w:pStyle w:val="a7"/>
+        <w:numPr>
+          <w:ilvl w:val="0"/>
+          <w:numId w:val="14"/>
+        </w:numPr>
+        <w:tabs>
+          <w:tab w:val="left" w:pos="1134"/>
+        </w:tabs>
+        <w:spacing w:after="0" w:line="360" w:lineRule="auto"/>
+        <w:rPr>
+          <w:rFonts w:eastAsia="Times New Roman" w:cs="Times New Roman"/>
+          <w:bCs/>
+          <w:szCs w:val="28"/>
+          <w:lang w:eastAsia="uk-UA"/>
+        </w:rPr>
+      </w:pPr>
+      <w:r>
+        <w:rPr>
+          <w:rFonts w:eastAsia="Times New Roman" w:cs="Times New Roman"/>
+          <w:bCs/>
+          <w:szCs w:val="28"/>
+          <w:lang w:eastAsia="uk-UA"/>
+        </w:rPr>
+        <w:t>Зв'язок – поіменована асоціація між двома або більше сутностями, що відображає їх взаємодію у реальному світі.</w:t>
+      </w:r>
+    </w:p>
+    <w:p>
+      <w:pPr>
+        <w:pStyle w:val="a7"/>
+        <w:numPr>
+          <w:ilvl w:val="0"/>
+          <w:numId w:val="12"/>
+        </w:numPr>
+        <w:tabs>
+          <w:tab w:val="left" w:pos="1276"/>
+        </w:tabs>
+        <w:spacing w:after="0" w:line="360" w:lineRule="auto"/>
+        <w:ind w:left="0" w:firstLine="851"/>
+        <w:rPr>
+          <w:rFonts w:eastAsia="Times New Roman" w:cs="Times New Roman"/>
+          <w:bCs/>
+          <w:szCs w:val="28"/>
+          <w:lang w:eastAsia="uk-UA"/>
+        </w:rPr>
+      </w:pPr>
+      <w:r>
+        <w:rPr>
+          <w:rFonts w:eastAsia="Times New Roman" w:cs="Times New Roman"/>
+          <w:bCs/>
+          <w:szCs w:val="28"/>
+          <w:lang w:eastAsia="uk-UA"/>
+        </w:rPr>
+        <w:t xml:space="preserve">Суть концептуального </w:t>
+      </w:r>
+      <w:proofErr w:type="spellStart"/>
+      <w:r>
+        <w:rPr>
+          <w:rFonts w:eastAsia="Times New Roman" w:cs="Times New Roman"/>
+          <w:bCs/>
+          <w:szCs w:val="28"/>
+          <w:lang w:eastAsia="uk-UA"/>
+        </w:rPr>
+        <w:t>проєктування</w:t>
+      </w:r>
+      <w:proofErr w:type="spellEnd"/>
+      <w:r>
+        <w:rPr>
+          <w:rFonts w:eastAsia="Times New Roman" w:cs="Times New Roman"/>
+          <w:bCs/>
+          <w:szCs w:val="28"/>
+          <w:lang w:eastAsia="uk-UA"/>
+        </w:rPr>
+        <w:t>:</w:t>
+      </w:r>
+    </w:p>
+    <w:p>
+      <w:pPr>
+        <w:tabs>
+          <w:tab w:val="left" w:pos="1134"/>
+        </w:tabs>
+        <w:spacing w:after="0" w:line="360" w:lineRule="auto"/>
+        <w:ind w:firstLine="709"/>
+        <w:rPr>
+          <w:rFonts w:eastAsia="Times New Roman" w:cs="Times New Roman"/>
+          <w:bCs/>
+          <w:szCs w:val="28"/>
+          <w:lang w:eastAsia="uk-UA"/>
+        </w:rPr>
+      </w:pPr>
+      <w:r>
+        <w:rPr>
+          <w:rFonts w:eastAsia="Times New Roman" w:cs="Times New Roman"/>
+          <w:bCs/>
+          <w:szCs w:val="28"/>
+          <w:lang w:eastAsia="uk-UA"/>
+        </w:rPr>
+        <w:lastRenderedPageBreak/>
+        <w:t xml:space="preserve">Полягає в описі й систематизації інформаційних вимог користувачів незалежно від конкретної СУБД та фізичних засобів збереження даних. Результатом є </w:t>
+      </w:r>
+      <w:proofErr w:type="spellStart"/>
+      <w:r>
+        <w:rPr>
+          <w:rFonts w:eastAsia="Times New Roman" w:cs="Times New Roman"/>
+          <w:bCs/>
+          <w:szCs w:val="28"/>
+          <w:lang w:eastAsia="uk-UA"/>
+        </w:rPr>
+        <w:t>високорівнева</w:t>
+      </w:r>
+      <w:proofErr w:type="spellEnd"/>
+      <w:r>
+        <w:rPr>
+          <w:rFonts w:eastAsia="Times New Roman" w:cs="Times New Roman"/>
+          <w:bCs/>
+          <w:szCs w:val="28"/>
+          <w:lang w:eastAsia="uk-UA"/>
+        </w:rPr>
+        <w:t xml:space="preserve"> ER-модель.</w:t>
+      </w:r>
+    </w:p>
+    <w:p>
+      <w:pPr>
+        <w:pStyle w:val="a7"/>
+        <w:numPr>
+          <w:ilvl w:val="0"/>
+          <w:numId w:val="12"/>
+        </w:numPr>
+        <w:tabs>
+          <w:tab w:val="left" w:pos="1276"/>
+        </w:tabs>
+        <w:spacing w:after="0" w:line="360" w:lineRule="auto"/>
+        <w:ind w:left="0" w:firstLine="851"/>
+        <w:rPr>
+          <w:rFonts w:eastAsia="Times New Roman" w:cs="Times New Roman"/>
+          <w:bCs/>
+          <w:szCs w:val="28"/>
+          <w:lang w:eastAsia="uk-UA"/>
+        </w:rPr>
+      </w:pPr>
+      <w:r>
+        <w:rPr>
+          <w:rFonts w:eastAsia="Times New Roman" w:cs="Times New Roman"/>
+          <w:bCs/>
+          <w:szCs w:val="28"/>
+          <w:lang w:eastAsia="uk-UA"/>
+        </w:rPr>
+        <w:t xml:space="preserve">Типи </w:t>
+      </w:r>
+      <w:proofErr w:type="spellStart"/>
+      <w:r>
+        <w:rPr>
+          <w:rFonts w:eastAsia="Times New Roman" w:cs="Times New Roman"/>
+          <w:bCs/>
+          <w:szCs w:val="28"/>
+          <w:lang w:eastAsia="uk-UA"/>
+        </w:rPr>
+        <w:t>зв’язків</w:t>
+      </w:r>
+      <w:proofErr w:type="spellEnd"/>
+      <w:r>
+        <w:rPr>
+          <w:rFonts w:eastAsia="Times New Roman" w:cs="Times New Roman"/>
+          <w:bCs/>
+          <w:szCs w:val="28"/>
+          <w:lang w:eastAsia="uk-UA"/>
+        </w:rPr>
+        <w:t>:</w:t>
+      </w:r>
+    </w:p>
+    <w:p>
+      <w:pPr>
+        <w:pStyle w:val="a7"/>
+        <w:numPr>
+          <w:ilvl w:val="0"/>
+          <w:numId w:val="15"/>
+        </w:numPr>
+        <w:tabs>
+          <w:tab w:val="left" w:pos="1134"/>
+        </w:tabs>
+        <w:spacing w:after="0" w:line="360" w:lineRule="auto"/>
+        <w:rPr>
+          <w:rFonts w:eastAsia="Times New Roman" w:cs="Times New Roman"/>
+          <w:bCs/>
+          <w:szCs w:val="28"/>
+          <w:lang w:eastAsia="uk-UA"/>
+        </w:rPr>
+      </w:pPr>
+      <w:r>
+        <w:rPr>
+          <w:rFonts w:eastAsia="Times New Roman" w:cs="Times New Roman"/>
+          <w:bCs/>
+          <w:szCs w:val="28"/>
+          <w:lang w:eastAsia="uk-UA"/>
+        </w:rPr>
+        <w:t>Один–до–одного (1:1): Кожен екземпляр однієї сутності пов'язаний лише з одним екземпляром іншої (наприклад, Паспорт – Громадянин).</w:t>
+      </w:r>
+    </w:p>
+    <w:p>
+      <w:pPr>
+        <w:pStyle w:val="a7"/>
+        <w:numPr>
+          <w:ilvl w:val="0"/>
+          <w:numId w:val="15"/>
+        </w:numPr>
+        <w:tabs>
+          <w:tab w:val="left" w:pos="1134"/>
+        </w:tabs>
+        <w:spacing w:after="0" w:line="360" w:lineRule="auto"/>
+        <w:rPr>
+          <w:rFonts w:eastAsia="Times New Roman" w:cs="Times New Roman"/>
+          <w:bCs/>
+          <w:szCs w:val="28"/>
+          <w:lang w:eastAsia="uk-UA"/>
+        </w:rPr>
+      </w:pPr>
+      <w:r>
+        <w:rPr>
+          <w:rFonts w:eastAsia="Times New Roman" w:cs="Times New Roman"/>
+          <w:bCs/>
+          <w:szCs w:val="28"/>
+          <w:lang w:eastAsia="uk-UA"/>
+        </w:rPr>
+        <w:t xml:space="preserve">Один–до–багатьох (1:M): Один екземпляр першої сутності </w:t>
+      </w:r>
+      <w:proofErr w:type="spellStart"/>
+      <w:r>
+        <w:rPr>
+          <w:rFonts w:eastAsia="Times New Roman" w:cs="Times New Roman"/>
+          <w:bCs/>
+          <w:szCs w:val="28"/>
+          <w:lang w:eastAsia="uk-UA"/>
+        </w:rPr>
+        <w:t>пов</w:t>
+      </w:r>
+      <w:proofErr w:type="spellEnd"/>
+      <w:r>
+        <w:rPr>
+          <w:rFonts w:eastAsia="Times New Roman" w:cs="Times New Roman"/>
+          <w:bCs/>
+          <w:szCs w:val="28"/>
+          <w:lang w:eastAsia="uk-UA"/>
+        </w:rPr>
+        <w:t xml:space="preserve"> </w:t>
+      </w:r>
+      <w:proofErr w:type="spellStart"/>
+      <w:r>
+        <w:rPr>
+          <w:rFonts w:eastAsia="Times New Roman" w:cs="Times New Roman"/>
+          <w:bCs/>
+          <w:szCs w:val="28"/>
+          <w:lang w:eastAsia="uk-UA"/>
+        </w:rPr>
+        <w:t>me</w:t>
+      </w:r>
+      <w:proofErr w:type="spellEnd"/>
+      <w:r>
+        <w:rPr>
+          <w:rFonts w:eastAsia="Times New Roman" w:cs="Times New Roman"/>
+          <w:bCs/>
+          <w:szCs w:val="28"/>
+          <w:lang w:eastAsia="uk-UA"/>
+        </w:rPr>
+        <w:t xml:space="preserve"> </w:t>
+      </w:r>
+      <w:proofErr w:type="spellStart"/>
+      <w:r>
+        <w:rPr>
+          <w:rFonts w:eastAsia="Times New Roman" w:cs="Times New Roman"/>
+          <w:bCs/>
+          <w:szCs w:val="28"/>
+          <w:lang w:eastAsia="uk-UA"/>
+        </w:rPr>
+        <w:t>пов</w:t>
+      </w:r>
+      <w:proofErr w:type="spellEnd"/>
+      <w:r>
+        <w:rPr>
+          <w:rFonts w:eastAsia="Times New Roman" w:cs="Times New Roman"/>
+          <w:bCs/>
+          <w:szCs w:val="28"/>
+          <w:lang w:eastAsia="uk-UA"/>
+        </w:rPr>
+        <w:t xml:space="preserve"> </w:t>
+      </w:r>
+      <w:proofErr w:type="spellStart"/>
+      <w:r>
+        <w:rPr>
+          <w:rFonts w:eastAsia="Times New Roman" w:cs="Times New Roman"/>
+          <w:bCs/>
+          <w:szCs w:val="28"/>
+          <w:lang w:eastAsia="uk-UA"/>
+        </w:rPr>
+        <w:t>me</w:t>
+      </w:r>
+      <w:proofErr w:type="spellEnd"/>
+      <w:r>
+        <w:rPr>
+          <w:rFonts w:eastAsia="Times New Roman" w:cs="Times New Roman"/>
+          <w:bCs/>
+          <w:szCs w:val="28"/>
+          <w:lang w:eastAsia="uk-UA"/>
+        </w:rPr>
+        <w:t xml:space="preserve"> зв'язаний з багатьма екземплярами другої (наприклад, Група – Студент).</w:t>
+      </w:r>
+    </w:p>
+    <w:p>
+      <w:pPr>
+        <w:pStyle w:val="a7"/>
+        <w:numPr>
+          <w:ilvl w:val="0"/>
+          <w:numId w:val="15"/>
+        </w:numPr>
+        <w:tabs>
+          <w:tab w:val="left" w:pos="1134"/>
+        </w:tabs>
+        <w:spacing w:after="0" w:line="360" w:lineRule="auto"/>
+        <w:rPr>
+          <w:rFonts w:eastAsia="Times New Roman" w:cs="Times New Roman"/>
+          <w:bCs/>
+          <w:szCs w:val="28"/>
+          <w:lang w:eastAsia="uk-UA"/>
+        </w:rPr>
+      </w:pPr>
+      <w:r>
+        <w:rPr>
+          <w:rFonts w:eastAsia="Times New Roman" w:cs="Times New Roman"/>
+          <w:bCs/>
+          <w:szCs w:val="28"/>
+          <w:lang w:eastAsia="uk-UA"/>
+        </w:rPr>
+        <w:t>Багато–до–багатьох (M:N): Багато екземплярів першої сутності можуть відповідати багатьом екземплярам другої (наприклад, Студент – Навчальна дисципліна).</w:t>
+      </w:r>
+    </w:p>
+    <w:p>
+      <w:pPr>
+        <w:pStyle w:val="a7"/>
+        <w:numPr>
+          <w:ilvl w:val="0"/>
+          <w:numId w:val="12"/>
+        </w:numPr>
+        <w:tabs>
+          <w:tab w:val="left" w:pos="1276"/>
+        </w:tabs>
+        <w:spacing w:after="0" w:line="360" w:lineRule="auto"/>
+        <w:ind w:left="0" w:firstLine="851"/>
+        <w:rPr>
+          <w:rFonts w:eastAsia="Times New Roman" w:cs="Times New Roman"/>
+          <w:bCs/>
+          <w:szCs w:val="28"/>
+          <w:lang w:eastAsia="uk-UA"/>
+        </w:rPr>
+      </w:pPr>
+      <w:r>
+        <w:rPr>
+          <w:rFonts w:eastAsia="Times New Roman" w:cs="Times New Roman"/>
+          <w:bCs/>
+          <w:szCs w:val="28"/>
+          <w:lang w:eastAsia="uk-UA"/>
+        </w:rPr>
+        <w:t>Основні елементи ER-діаграм у нотації Чена:</w:t>
+      </w:r>
+    </w:p>
+    <w:p>
+      <w:pPr>
+        <w:pStyle w:val="a7"/>
+        <w:numPr>
+          <w:ilvl w:val="0"/>
+          <w:numId w:val="16"/>
+        </w:numPr>
+        <w:tabs>
+          <w:tab w:val="left" w:pos="1134"/>
+        </w:tabs>
+        <w:spacing w:after="0" w:line="360" w:lineRule="auto"/>
+        <w:rPr>
+          <w:rFonts w:eastAsia="Times New Roman" w:cs="Times New Roman"/>
+          <w:bCs/>
+          <w:szCs w:val="28"/>
+          <w:lang w:eastAsia="uk-UA"/>
+        </w:rPr>
+      </w:pPr>
+      <w:r>
+        <w:rPr>
+          <w:rFonts w:eastAsia="Times New Roman" w:cs="Times New Roman"/>
+          <w:bCs/>
+          <w:szCs w:val="28"/>
+          <w:lang w:eastAsia="uk-UA"/>
+        </w:rPr>
+        <w:t>Прямокутник: позначення сутності.</w:t>
+      </w:r>
+    </w:p>
+    <w:p>
+      <w:pPr>
+        <w:pStyle w:val="a7"/>
+        <w:numPr>
+          <w:ilvl w:val="0"/>
+          <w:numId w:val="16"/>
+        </w:numPr>
+        <w:tabs>
+          <w:tab w:val="left" w:pos="1134"/>
+        </w:tabs>
+        <w:spacing w:after="0" w:line="360" w:lineRule="auto"/>
+        <w:rPr>
+          <w:rFonts w:eastAsia="Times New Roman" w:cs="Times New Roman"/>
+          <w:bCs/>
+          <w:szCs w:val="28"/>
+          <w:lang w:eastAsia="uk-UA"/>
+        </w:rPr>
+      </w:pPr>
+      <w:r>
+        <w:rPr>
+          <w:rFonts w:eastAsia="Times New Roman" w:cs="Times New Roman"/>
+          <w:bCs/>
+          <w:szCs w:val="28"/>
+          <w:lang w:eastAsia="uk-UA"/>
+        </w:rPr>
+        <w:t>Овал (еліпс): позначення атрибута.</w:t>
+      </w:r>
+    </w:p>
+    <w:p>
+      <w:pPr>
+        <w:pStyle w:val="a7"/>
+        <w:numPr>
+          <w:ilvl w:val="0"/>
+          <w:numId w:val="16"/>
+        </w:numPr>
+        <w:tabs>
+          <w:tab w:val="left" w:pos="1134"/>
+        </w:tabs>
+        <w:spacing w:after="0" w:line="360" w:lineRule="auto"/>
+        <w:rPr>
+          <w:rFonts w:eastAsia="Times New Roman" w:cs="Times New Roman"/>
+          <w:bCs/>
+          <w:szCs w:val="28"/>
+          <w:lang w:eastAsia="uk-UA"/>
+        </w:rPr>
+      </w:pPr>
+      <w:r>
+        <w:rPr>
+          <w:rFonts w:eastAsia="Times New Roman" w:cs="Times New Roman"/>
+          <w:bCs/>
+          <w:szCs w:val="28"/>
+          <w:lang w:eastAsia="uk-UA"/>
+        </w:rPr>
+        <w:t>Ромб: позначення зв’язку між сутностями.</w:t>
+      </w:r>
+    </w:p>
+    <w:p>
+      <w:pPr>
+        <w:pStyle w:val="a7"/>
+        <w:numPr>
+          <w:ilvl w:val="0"/>
+          <w:numId w:val="16"/>
+        </w:numPr>
+        <w:tabs>
+          <w:tab w:val="left" w:pos="1134"/>
+        </w:tabs>
+        <w:spacing w:after="0" w:line="360" w:lineRule="auto"/>
+        <w:rPr>
+          <w:rFonts w:eastAsia="Times New Roman" w:cs="Times New Roman"/>
+          <w:bCs/>
+          <w:szCs w:val="28"/>
+          <w:lang w:eastAsia="uk-UA"/>
+        </w:rPr>
+      </w:pPr>
+      <w:r>
+        <w:rPr>
+          <w:rFonts w:eastAsia="Times New Roman" w:cs="Times New Roman"/>
+          <w:bCs/>
+          <w:szCs w:val="28"/>
+          <w:lang w:eastAsia="uk-UA"/>
+        </w:rPr>
+        <w:t>Лінії: зв’язують атрибути із сутностями та сутності з ромбами зв’язку.</w:t>
+      </w:r>
+    </w:p>
+    <w:p>
+      <w:pPr>
+        <w:pStyle w:val="a7"/>
+        <w:numPr>
+          <w:ilvl w:val="0"/>
+          <w:numId w:val="12"/>
+        </w:numPr>
+        <w:tabs>
+          <w:tab w:val="left" w:pos="1276"/>
+        </w:tabs>
+        <w:spacing w:after="0" w:line="360" w:lineRule="auto"/>
+        <w:ind w:left="0" w:firstLine="851"/>
+        <w:rPr>
+          <w:rFonts w:eastAsia="Times New Roman" w:cs="Times New Roman"/>
+          <w:bCs/>
+          <w:szCs w:val="28"/>
+          <w:lang w:eastAsia="uk-UA"/>
+        </w:rPr>
+      </w:pPr>
+      <w:r>
+        <w:rPr>
+          <w:rFonts w:eastAsia="Times New Roman" w:cs="Times New Roman"/>
+          <w:bCs/>
+          <w:szCs w:val="28"/>
+          <w:lang w:eastAsia="uk-UA"/>
+        </w:rPr>
+        <w:t>Основні елементи ER-діаграм у нотації Мартіна («вороняча лапка»):</w:t>
+      </w:r>
+    </w:p>
+    <w:p>
+      <w:pPr>
+        <w:pStyle w:val="a7"/>
+        <w:numPr>
+          <w:ilvl w:val="0"/>
+          <w:numId w:val="17"/>
+        </w:numPr>
+        <w:tabs>
+          <w:tab w:val="left" w:pos="1418"/>
+        </w:tabs>
+        <w:spacing w:after="0" w:line="360" w:lineRule="auto"/>
+        <w:ind w:left="0" w:firstLine="993"/>
+        <w:rPr>
+          <w:rFonts w:eastAsia="Times New Roman" w:cs="Times New Roman"/>
+          <w:bCs/>
+          <w:szCs w:val="28"/>
+          <w:lang w:eastAsia="uk-UA"/>
+        </w:rPr>
+      </w:pPr>
+      <w:r>
+        <w:rPr>
+          <w:rFonts w:eastAsia="Times New Roman" w:cs="Times New Roman"/>
+          <w:bCs/>
+          <w:szCs w:val="28"/>
+          <w:lang w:eastAsia="uk-UA"/>
+        </w:rPr>
+        <w:t>Прямокутник: сутність (із переліком атрибутів всередині).</w:t>
+      </w:r>
+    </w:p>
+    <w:p>
+      <w:pPr>
+        <w:pStyle w:val="a7"/>
+        <w:numPr>
+          <w:ilvl w:val="0"/>
+          <w:numId w:val="17"/>
+        </w:numPr>
+        <w:tabs>
+          <w:tab w:val="left" w:pos="1418"/>
+        </w:tabs>
+        <w:spacing w:after="0" w:line="360" w:lineRule="auto"/>
+        <w:ind w:left="0" w:firstLine="993"/>
+        <w:rPr>
+          <w:rFonts w:eastAsia="Times New Roman" w:cs="Times New Roman"/>
+          <w:bCs/>
+          <w:szCs w:val="28"/>
+          <w:lang w:eastAsia="uk-UA"/>
+        </w:rPr>
+      </w:pPr>
+      <w:r>
+        <w:rPr>
+          <w:rFonts w:eastAsia="Times New Roman" w:cs="Times New Roman"/>
+          <w:bCs/>
+          <w:szCs w:val="28"/>
+          <w:lang w:eastAsia="uk-UA"/>
+        </w:rPr>
+        <w:t xml:space="preserve">Лінії з позначками на кінцях: відображають обов'язковість та </w:t>
+      </w:r>
+      <w:proofErr w:type="spellStart"/>
+      <w:r>
+        <w:rPr>
+          <w:rFonts w:eastAsia="Times New Roman" w:cs="Times New Roman"/>
+          <w:bCs/>
+          <w:szCs w:val="28"/>
+          <w:lang w:eastAsia="uk-UA"/>
+        </w:rPr>
+        <w:t>кардинальність</w:t>
+      </w:r>
+      <w:proofErr w:type="spellEnd"/>
+      <w:r>
+        <w:rPr>
+          <w:rFonts w:eastAsia="Times New Roman" w:cs="Times New Roman"/>
+          <w:bCs/>
+          <w:szCs w:val="28"/>
+          <w:lang w:eastAsia="uk-UA"/>
+        </w:rPr>
+        <w:t xml:space="preserve"> зв'язку:</w:t>
+      </w:r>
+    </w:p>
+    <w:p>
+      <w:pPr>
+        <w:pStyle w:val="a7"/>
+        <w:numPr>
+          <w:ilvl w:val="0"/>
+          <w:numId w:val="17"/>
+        </w:numPr>
+        <w:tabs>
+          <w:tab w:val="left" w:pos="1134"/>
+        </w:tabs>
+        <w:spacing w:after="0" w:line="360" w:lineRule="auto"/>
+        <w:ind w:left="1701" w:firstLine="0"/>
+        <w:rPr>
+          <w:rFonts w:eastAsia="Times New Roman" w:cs="Times New Roman"/>
+          <w:bCs/>
+          <w:szCs w:val="28"/>
+          <w:lang w:eastAsia="uk-UA"/>
+        </w:rPr>
+      </w:pPr>
+      <w:r>
+        <w:rPr>
+          <w:rFonts w:eastAsia="Times New Roman" w:cs="Times New Roman"/>
+          <w:bCs/>
+          <w:szCs w:val="28"/>
+          <w:lang w:eastAsia="uk-UA"/>
+        </w:rPr>
+        <w:t xml:space="preserve">Одинарна риска </w:t>
+      </w:r>
+      <w:r>
+        <w:rPr>
+          <w:bCs/>
+          <w:szCs w:val="28"/>
+        </w:rPr>
+        <w:t>–</w:t>
+      </w:r>
+      <w:r>
+        <w:rPr>
+          <w:rFonts w:eastAsia="Times New Roman" w:cs="Times New Roman"/>
+          <w:bCs/>
+          <w:szCs w:val="28"/>
+          <w:lang w:eastAsia="uk-UA"/>
+        </w:rPr>
+        <w:t xml:space="preserve"> один.</w:t>
+      </w:r>
+    </w:p>
+    <w:p>
+      <w:pPr>
+        <w:pStyle w:val="a7"/>
+        <w:numPr>
+          <w:ilvl w:val="0"/>
+          <w:numId w:val="17"/>
+        </w:numPr>
+        <w:tabs>
+          <w:tab w:val="left" w:pos="1134"/>
+        </w:tabs>
+        <w:spacing w:after="0" w:line="360" w:lineRule="auto"/>
+        <w:ind w:left="1701" w:firstLine="0"/>
+        <w:rPr>
+          <w:rFonts w:eastAsia="Times New Roman" w:cs="Times New Roman"/>
+          <w:bCs/>
+          <w:szCs w:val="28"/>
+          <w:lang w:eastAsia="uk-UA"/>
+        </w:rPr>
+      </w:pPr>
+      <w:r>
+        <w:rPr>
+          <w:rFonts w:eastAsia="Times New Roman" w:cs="Times New Roman"/>
+          <w:bCs/>
+          <w:szCs w:val="28"/>
+          <w:lang w:eastAsia="uk-UA"/>
+        </w:rPr>
+        <w:t xml:space="preserve">«Вороняча лапка» </w:t>
+      </w:r>
+      <w:r>
+        <w:rPr>
+          <w:bCs/>
+          <w:szCs w:val="28"/>
+        </w:rPr>
+        <w:t>–</w:t>
+      </w:r>
+      <w:r>
+        <w:rPr>
+          <w:rFonts w:eastAsia="Times New Roman" w:cs="Times New Roman"/>
+          <w:bCs/>
+          <w:szCs w:val="28"/>
+          <w:lang w:eastAsia="uk-UA"/>
+        </w:rPr>
+        <w:t xml:space="preserve"> багато.</w:t>
+      </w:r>
+    </w:p>
+    <w:p>
+      <w:pPr>
+        <w:pStyle w:val="a7"/>
+        <w:numPr>
+          <w:ilvl w:val="0"/>
+          <w:numId w:val="17"/>
+        </w:numPr>
+        <w:tabs>
+          <w:tab w:val="left" w:pos="1134"/>
+        </w:tabs>
+        <w:spacing w:after="0" w:line="360" w:lineRule="auto"/>
+        <w:ind w:left="1701" w:firstLine="0"/>
+        <w:rPr>
+          <w:rFonts w:eastAsia="Times New Roman" w:cs="Times New Roman"/>
+          <w:bCs/>
+          <w:szCs w:val="28"/>
+          <w:lang w:eastAsia="uk-UA"/>
+        </w:rPr>
+      </w:pPr>
+      <w:r>
+        <w:rPr>
+          <w:rFonts w:eastAsia="Times New Roman" w:cs="Times New Roman"/>
+          <w:bCs/>
+          <w:szCs w:val="28"/>
+          <w:lang w:eastAsia="uk-UA"/>
+        </w:rPr>
+        <w:t xml:space="preserve">Кружечок </w:t>
+      </w:r>
+      <w:r>
+        <w:rPr>
+          <w:bCs/>
+          <w:szCs w:val="28"/>
+        </w:rPr>
+        <w:t>–</w:t>
+      </w:r>
+      <w:r>
+        <w:rPr>
+          <w:rFonts w:eastAsia="Times New Roman" w:cs="Times New Roman"/>
+          <w:bCs/>
+          <w:szCs w:val="28"/>
+          <w:lang w:eastAsia="uk-UA"/>
+        </w:rPr>
+        <w:t xml:space="preserve"> нуль (необов'язковий зв'язок).</w:t>
+      </w:r>
+    </w:p>
+    <w:p>
+      <w:pPr>
         <w:spacing w:after="0" w:line="360" w:lineRule="auto"/>
         <w:ind w:firstLine="720"/>
         <w:rPr>
           <w:rFonts w:eastAsia="Times New Roman" w:cs="Times New Roman"/>
           <w:b/>
           <w:szCs w:val="28"/>
-          <w:lang w:val="ru-RU" w:eastAsia="uk-UA"/>
+          <w:lang w:eastAsia="uk-UA"/>
         </w:rPr>
       </w:pPr>
       <w:r>
@@ -8736,30 +9853,32 @@
         <w:spacing w:after="240" w:line="360" w:lineRule="auto"/>
         <w:ind w:firstLine="720"/>
         <w:jc w:val="both"/>
-        <w:rPr>
-          <w:lang w:val="ru-RU"/>
-        </w:rPr>
       </w:pPr>
       <w:r>
-        <w:rPr>
-          <w:lang w:val="ru-RU"/>
-        </w:rPr>
         <w:t>П</w:t>
       </w:r>
       <w:r>
-        <w:rPr>
-          <w:lang w:val="ru-RU"/>
-        </w:rPr>
-        <w:t xml:space="preserve">ід час виконання лабораторної роботи № 1 було засвоєно теоретичні засади та практичні навички концептуального проєктування баз даних. Було доповнено та деталізовано </w:t>
+        <w:t xml:space="preserve">ід час виконання лабораторної роботи № 1 було засвоєно теоретичні засади та практичні навички концептуального </w:t>
+      </w:r>
+      <w:proofErr w:type="spellStart"/>
+      <w:r>
+        <w:t>проєктування</w:t>
+      </w:r>
+      <w:proofErr w:type="spellEnd"/>
+      <w:r>
+        <w:t xml:space="preserve"> баз даних. Було доповнено та деталізовано ER-діаграму предметної області «Деканат ВНЗ», </w:t>
       </w:r>
       <w:r>
-        <w:t>ER</w:t>
+        <w:lastRenderedPageBreak/>
+        <w:t xml:space="preserve">визначено типи та значення </w:t>
       </w:r>
+      <w:proofErr w:type="spellStart"/>
       <w:r>
-        <w:rPr>
-          <w:lang w:val="ru-RU"/>
-        </w:rPr>
-        <w:t>-діаграму предметної області «Деканат ВНЗ», визначено типи та значення зв'язків між сутностями. Окрім цього, самостійно проаналізовано 5 різних предметних областей, для кожної з яких визначено по 5 сутностей, розроблено специфікації атрибутів та структури відповідних таблиць.</w:t>
+        <w:t>зв'язків</w:t>
+      </w:r>
+      <w:proofErr w:type="spellEnd"/>
+      <w:r>
+        <w:t xml:space="preserve"> між сутностями. Окрім цього, самостійно проаналізовано 5 різних предметних областей, для кожної з яких визначено по 5 сутностей, розроблено специфікації атрибутів та структури відповідних таблиць.</w:t>
       </w:r>
     </w:p>
     <w:sectPr>
@@ -8775,7 +9894,7 @@
 </file>
 
 <file path=word/numbering.xml><?xml version="1.0" encoding="utf-8"?>
-<w:numbering xmlns:wpc="http://schemas.microsoft.com/office/word/2010/wordprocessingCanvas" xmlns:cx="http://schemas.microsoft.com/office/drawing/2014/chartex" xmlns:cx1="http://schemas.microsoft.com/office/drawing/2015/9/8/chartex" xmlns:cx2="http://schemas.microsoft.com/office/drawing/2015/10/21/chartex" xmlns:cx3="http://schemas.microsoft.com/office/drawing/2016/5/9/chartex" xmlns:cx4="http://schemas.microsoft.com/office/drawing/2016/5/10/chartex" xmlns:cx5="http://schemas.microsoft.com/office/drawing/2016/5/11/chartex" xmlns:cx6="http://schemas.microsoft.com/office/drawing/2016/5/12/chartex" xmlns:cx7="http://schemas.microsoft.com/office/drawing/2016/5/13/chartex" xmlns:cx8="http://schemas.microsoft.com/office/drawing/2016/5/14/chartex" xmlns:mc="http://schemas.openxmlformats.org/markup-compatibility/2006" xmlns:aink="http://schemas.microsoft.com/office/drawing/2016/ink" xmlns:am3d="http://schemas.microsoft.com/office/drawing/2017/model3d" xmlns:o="urn:schemas-microsoft-com:office:office" xmlns:oel="http://schemas.microsoft.com/office/2019/extlst" xmlns:r="http://schemas.openxmlformats.org/officeDocument/2006/relationships" xmlns:m="http://schemas.openxmlformats.org/officeDocument/2006/math" xmlns:v="urn:schemas-microsoft-com:vml" xmlns:wp14="http://schemas.microsoft.com/office/word/2010/wordprocessingDrawing" xmlns:wp="http://schemas.openxmlformats.org/drawingml/2006/wordprocessingDrawing" xmlns:w10="urn:schemas-microsoft-com:office:word" xmlns:w="http://schemas.openxmlformats.org/wordprocessingml/2006/main" xmlns:w14="http://schemas.microsoft.com/office/word/2010/wordml" xmlns:w15="http://schemas.microsoft.com/office/word/2012/wordml" xmlns:w16cex="http://schemas.microsoft.com/office/word/2018/wordml/cex" xmlns:w16cid="http://schemas.microsoft.com/office/word/2016/wordml/cid" xmlns:w16="http://schemas.microsoft.com/office/word/2018/wordml" xmlns:w16du="http://schemas.microsoft.com/office/word/2023/wordml/word16du" xmlns:w16sdtdh="http://schemas.microsoft.com/office/word/2020/wordml/sdtdatahash" xmlns:w16sdtfl="http://schemas.microsoft.com/office/word/2024/wordml/sdtformatlock" xmlns:w16se="http://schemas.microsoft.com/office/word/2015/wordml/symex" xmlns:wpg="http://schemas.microsoft.com/office/word/2010/wordprocessingGroup" xmlns:wpi="http://schemas.microsoft.com/office/word/2010/wordprocessingInk" xmlns:wne="http://schemas.microsoft.com/office/word/2006/wordml" xmlns:wps="http://schemas.microsoft.com/office/word/2010/wordprocessingShape" mc:Ignorable="w14 w15 w16se w16cid w16 w16cex w16sdtdh w16sdtfl w16du wp14">
+<w:numbering xmlns:wpc="http://schemas.microsoft.com/office/word/2010/wordprocessingCanvas" xmlns:cx="http://schemas.microsoft.com/office/drawing/2014/chartex" xmlns:cx1="http://schemas.microsoft.com/office/drawing/2015/9/8/chartex" xmlns:cx2="http://schemas.microsoft.com/office/drawing/2015/10/21/chartex" xmlns:cx3="http://schemas.microsoft.com/office/drawing/2016/5/9/chartex" xmlns:cx4="http://schemas.microsoft.com/office/drawing/2016/5/10/chartex" xmlns:cx5="http://schemas.microsoft.com/office/drawing/2016/5/11/chartex" xmlns:cx6="http://schemas.microsoft.com/office/drawing/2016/5/12/chartex" xmlns:cx7="http://schemas.microsoft.com/office/drawing/2016/5/13/chartex" xmlns:cx8="http://schemas.microsoft.com/office/drawing/2016/5/14/chartex" xmlns:mc="http://schemas.openxmlformats.org/markup-compatibility/2006" xmlns:aink="http://schemas.microsoft.com/office/drawing/2016/ink" xmlns:am3d="http://schemas.microsoft.com/office/drawing/2017/model3d" xmlns:o="urn:schemas-microsoft-com:office:office" xmlns:oel="http://schemas.microsoft.com/office/2019/extlst" xmlns:r="http://schemas.openxmlformats.org/officeDocument/2006/relationships" xmlns:m="http://schemas.openxmlformats.org/officeDocument/2006/math" xmlns:v="urn:schemas-microsoft-com:vml" xmlns:wp14="http://schemas.microsoft.com/office/word/2010/wordprocessingDrawing" xmlns:wp="http://schemas.openxmlformats.org/drawingml/2006/wordprocessingDrawing" xmlns:w10="urn:schemas-microsoft-com:office:word" xmlns:w="http://schemas.openxmlformats.org/wordprocessingml/2006/main" xmlns:w14="http://schemas.microsoft.com/office/word/2010/wordml" xmlns:w15="http://schemas.microsoft.com/office/word/2012/wordml" xmlns:w16cex="http://schemas.microsoft.com/office/word/2018/wordml/cex" xmlns:w16cid="http://schemas.microsoft.com/office/word/2016/wordml/cid" xmlns:w16="http://schemas.microsoft.com/office/word/2018/wordml" xmlns:w16sdtdh="http://schemas.microsoft.com/office/word/2020/wordml/sdtdatahash" xmlns:w16se="http://schemas.microsoft.com/office/word/2015/wordml/symex" xmlns:wpg="http://schemas.microsoft.com/office/word/2010/wordprocessingGroup" xmlns:wpi="http://schemas.microsoft.com/office/word/2010/wordprocessingInk" xmlns:wne="http://schemas.microsoft.com/office/word/2006/wordml" xmlns:wps="http://schemas.microsoft.com/office/word/2010/wordprocessingShape" mc:Ignorable="w14 w15 w16se w16cid w16 w16cex w16sdtdh wp14">
   <w:abstractNum w:abstractNumId="0" w15:restartNumberingAfterBreak="0">
     <w:nsid w:val="03DE08EE"/>
     <w:multiLevelType w:val="hybridMultilevel"/>
@@ -8868,7 +9987,7 @@
   <w:abstractNum w:abstractNumId="1" w15:restartNumberingAfterBreak="0">
     <w:nsid w:val="05EB2A14"/>
     <w:multiLevelType w:val="hybridMultilevel"/>
-    <w:tmpl w:val="FBFEEDF8"/>
+    <w:tmpl w:val="7D6073FC"/>
     <w:lvl w:ilvl="0" w:tplc="39969B4E">
       <w:start w:val="1"/>
       <w:numFmt w:val="decimal"/>
@@ -8956,6 +10075,232 @@
     </w:lvl>
   </w:abstractNum>
   <w:abstractNum w:abstractNumId="2" w15:restartNumberingAfterBreak="0">
+    <w:nsid w:val="10BB7DB0"/>
+    <w:multiLevelType w:val="hybridMultilevel"/>
+    <w:tmpl w:val="4CDCE1F0"/>
+    <w:lvl w:ilvl="0" w:tplc="04190001">
+      <w:start w:val="1"/>
+      <w:numFmt w:val="bullet"/>
+      <w:lvlText w:val=""/>
+      <w:lvlJc w:val="left"/>
+      <w:pPr>
+        <w:ind w:left="1429" w:hanging="360"/>
+      </w:pPr>
+      <w:rPr>
+        <w:rFonts w:ascii="Symbol" w:hAnsi="Symbol" w:hint="default"/>
+      </w:rPr>
+    </w:lvl>
+    <w:lvl w:ilvl="1" w:tplc="04190003" w:tentative="1">
+      <w:start w:val="1"/>
+      <w:numFmt w:val="bullet"/>
+      <w:lvlText w:val="o"/>
+      <w:lvlJc w:val="left"/>
+      <w:pPr>
+        <w:ind w:left="2149" w:hanging="360"/>
+      </w:pPr>
+      <w:rPr>
+        <w:rFonts w:ascii="Courier New" w:hAnsi="Courier New" w:cs="Courier New" w:hint="default"/>
+      </w:rPr>
+    </w:lvl>
+    <w:lvl w:ilvl="2" w:tplc="04190005" w:tentative="1">
+      <w:start w:val="1"/>
+      <w:numFmt w:val="bullet"/>
+      <w:lvlText w:val=""/>
+      <w:lvlJc w:val="left"/>
+      <w:pPr>
+        <w:ind w:left="2869" w:hanging="360"/>
+      </w:pPr>
+      <w:rPr>
+        <w:rFonts w:ascii="Wingdings" w:hAnsi="Wingdings" w:hint="default"/>
+      </w:rPr>
+    </w:lvl>
+    <w:lvl w:ilvl="3" w:tplc="04190001" w:tentative="1">
+      <w:start w:val="1"/>
+      <w:numFmt w:val="bullet"/>
+      <w:lvlText w:val=""/>
+      <w:lvlJc w:val="left"/>
+      <w:pPr>
+        <w:ind w:left="3589" w:hanging="360"/>
+      </w:pPr>
+      <w:rPr>
+        <w:rFonts w:ascii="Symbol" w:hAnsi="Symbol" w:hint="default"/>
+      </w:rPr>
+    </w:lvl>
+    <w:lvl w:ilvl="4" w:tplc="04190003" w:tentative="1">
+      <w:start w:val="1"/>
+      <w:numFmt w:val="bullet"/>
+      <w:lvlText w:val="o"/>
+      <w:lvlJc w:val="left"/>
+      <w:pPr>
+        <w:ind w:left="4309" w:hanging="360"/>
+      </w:pPr>
+      <w:rPr>
+        <w:rFonts w:ascii="Courier New" w:hAnsi="Courier New" w:cs="Courier New" w:hint="default"/>
+      </w:rPr>
+    </w:lvl>
+    <w:lvl w:ilvl="5" w:tplc="04190005" w:tentative="1">
+      <w:start w:val="1"/>
+      <w:numFmt w:val="bullet"/>
+      <w:lvlText w:val=""/>
+      <w:lvlJc w:val="left"/>
+      <w:pPr>
+        <w:ind w:left="5029" w:hanging="360"/>
+      </w:pPr>
+      <w:rPr>
+        <w:rFonts w:ascii="Wingdings" w:hAnsi="Wingdings" w:hint="default"/>
+      </w:rPr>
+    </w:lvl>
+    <w:lvl w:ilvl="6" w:tplc="04190001" w:tentative="1">
+      <w:start w:val="1"/>
+      <w:numFmt w:val="bullet"/>
+      <w:lvlText w:val=""/>
+      <w:lvlJc w:val="left"/>
+      <w:pPr>
+        <w:ind w:left="5749" w:hanging="360"/>
+      </w:pPr>
+      <w:rPr>
+        <w:rFonts w:ascii="Symbol" w:hAnsi="Symbol" w:hint="default"/>
+      </w:rPr>
+    </w:lvl>
+    <w:lvl w:ilvl="7" w:tplc="04190003" w:tentative="1">
+      <w:start w:val="1"/>
+      <w:numFmt w:val="bullet"/>
+      <w:lvlText w:val="o"/>
+      <w:lvlJc w:val="left"/>
+      <w:pPr>
+        <w:ind w:left="6469" w:hanging="360"/>
+      </w:pPr>
+      <w:rPr>
+        <w:rFonts w:ascii="Courier New" w:hAnsi="Courier New" w:cs="Courier New" w:hint="default"/>
+      </w:rPr>
+    </w:lvl>
+    <w:lvl w:ilvl="8" w:tplc="04190005" w:tentative="1">
+      <w:start w:val="1"/>
+      <w:numFmt w:val="bullet"/>
+      <w:lvlText w:val=""/>
+      <w:lvlJc w:val="left"/>
+      <w:pPr>
+        <w:ind w:left="7189" w:hanging="360"/>
+      </w:pPr>
+      <w:rPr>
+        <w:rFonts w:ascii="Wingdings" w:hAnsi="Wingdings" w:hint="default"/>
+      </w:rPr>
+    </w:lvl>
+  </w:abstractNum>
+  <w:abstractNum w:abstractNumId="3" w15:restartNumberingAfterBreak="0">
+    <w:nsid w:val="111160AF"/>
+    <w:multiLevelType w:val="hybridMultilevel"/>
+    <w:tmpl w:val="D34C9DF8"/>
+    <w:lvl w:ilvl="0" w:tplc="04190001">
+      <w:start w:val="1"/>
+      <w:numFmt w:val="bullet"/>
+      <w:lvlText w:val=""/>
+      <w:lvlJc w:val="left"/>
+      <w:pPr>
+        <w:ind w:left="1429" w:hanging="360"/>
+      </w:pPr>
+      <w:rPr>
+        <w:rFonts w:ascii="Symbol" w:hAnsi="Symbol" w:hint="default"/>
+      </w:rPr>
+    </w:lvl>
+    <w:lvl w:ilvl="1" w:tplc="04190003" w:tentative="1">
+      <w:start w:val="1"/>
+      <w:numFmt w:val="bullet"/>
+      <w:lvlText w:val="o"/>
+      <w:lvlJc w:val="left"/>
+      <w:pPr>
+        <w:ind w:left="2149" w:hanging="360"/>
+      </w:pPr>
+      <w:rPr>
+        <w:rFonts w:ascii="Courier New" w:hAnsi="Courier New" w:cs="Courier New" w:hint="default"/>
+      </w:rPr>
+    </w:lvl>
+    <w:lvl w:ilvl="2" w:tplc="04190005" w:tentative="1">
+      <w:start w:val="1"/>
+      <w:numFmt w:val="bullet"/>
+      <w:lvlText w:val=""/>
+      <w:lvlJc w:val="left"/>
+      <w:pPr>
+        <w:ind w:left="2869" w:hanging="360"/>
+      </w:pPr>
+      <w:rPr>
+        <w:rFonts w:ascii="Wingdings" w:hAnsi="Wingdings" w:hint="default"/>
+      </w:rPr>
+    </w:lvl>
+    <w:lvl w:ilvl="3" w:tplc="04190001" w:tentative="1">
+      <w:start w:val="1"/>
+      <w:numFmt w:val="bullet"/>
+      <w:lvlText w:val=""/>
+      <w:lvlJc w:val="left"/>
+      <w:pPr>
+        <w:ind w:left="3589" w:hanging="360"/>
+      </w:pPr>
+      <w:rPr>
+        <w:rFonts w:ascii="Symbol" w:hAnsi="Symbol" w:hint="default"/>
+      </w:rPr>
+    </w:lvl>
+    <w:lvl w:ilvl="4" w:tplc="04190003" w:tentative="1">
+      <w:start w:val="1"/>
+      <w:numFmt w:val="bullet"/>
+      <w:lvlText w:val="o"/>
+      <w:lvlJc w:val="left"/>
+      <w:pPr>
+        <w:ind w:left="4309" w:hanging="360"/>
+      </w:pPr>
+      <w:rPr>
+        <w:rFonts w:ascii="Courier New" w:hAnsi="Courier New" w:cs="Courier New" w:hint="default"/>
+      </w:rPr>
+    </w:lvl>
+    <w:lvl w:ilvl="5" w:tplc="04190005" w:tentative="1">
+      <w:start w:val="1"/>
+      <w:numFmt w:val="bullet"/>
+      <w:lvlText w:val=""/>
+      <w:lvlJc w:val="left"/>
+      <w:pPr>
+        <w:ind w:left="5029" w:hanging="360"/>
+      </w:pPr>
+      <w:rPr>
+        <w:rFonts w:ascii="Wingdings" w:hAnsi="Wingdings" w:hint="default"/>
+      </w:rPr>
+    </w:lvl>
+    <w:lvl w:ilvl="6" w:tplc="04190001" w:tentative="1">
+      <w:start w:val="1"/>
+      <w:numFmt w:val="bullet"/>
+      <w:lvlText w:val=""/>
+      <w:lvlJc w:val="left"/>
+      <w:pPr>
+        <w:ind w:left="5749" w:hanging="360"/>
+      </w:pPr>
+      <w:rPr>
+        <w:rFonts w:ascii="Symbol" w:hAnsi="Symbol" w:hint="default"/>
+      </w:rPr>
+    </w:lvl>
+    <w:lvl w:ilvl="7" w:tplc="04190003" w:tentative="1">
+      <w:start w:val="1"/>
+      <w:numFmt w:val="bullet"/>
+      <w:lvlText w:val="o"/>
+      <w:lvlJc w:val="left"/>
+      <w:pPr>
+        <w:ind w:left="6469" w:hanging="360"/>
+      </w:pPr>
+      <w:rPr>
+        <w:rFonts w:ascii="Courier New" w:hAnsi="Courier New" w:cs="Courier New" w:hint="default"/>
+      </w:rPr>
+    </w:lvl>
+    <w:lvl w:ilvl="8" w:tplc="04190005" w:tentative="1">
+      <w:start w:val="1"/>
+      <w:numFmt w:val="bullet"/>
+      <w:lvlText w:val=""/>
+      <w:lvlJc w:val="left"/>
+      <w:pPr>
+        <w:ind w:left="7189" w:hanging="360"/>
+      </w:pPr>
+      <w:rPr>
+        <w:rFonts w:ascii="Wingdings" w:hAnsi="Wingdings" w:hint="default"/>
+      </w:rPr>
+    </w:lvl>
+  </w:abstractNum>
+  <w:abstractNum w:abstractNumId="4" w15:restartNumberingAfterBreak="0">
     <w:nsid w:val="11907138"/>
     <w:multiLevelType w:val="hybridMultilevel"/>
     <w:tmpl w:val="AF26C27E"/>
@@ -9067,7 +10412,7 @@
       </w:rPr>
     </w:lvl>
   </w:abstractNum>
-  <w:abstractNum w:abstractNumId="3" w15:restartNumberingAfterBreak="0">
+  <w:abstractNum w:abstractNumId="5" w15:restartNumberingAfterBreak="0">
     <w:nsid w:val="13BD7CBB"/>
     <w:multiLevelType w:val="hybridMultilevel"/>
     <w:tmpl w:val="E8E65202"/>
@@ -9156,7 +10501,7 @@
       </w:pPr>
     </w:lvl>
   </w:abstractNum>
-  <w:abstractNum w:abstractNumId="4" w15:restartNumberingAfterBreak="0">
+  <w:abstractNum w:abstractNumId="6" w15:restartNumberingAfterBreak="0">
     <w:nsid w:val="1F9668F3"/>
     <w:multiLevelType w:val="hybridMultilevel"/>
     <w:tmpl w:val="1032B728"/>
@@ -9242,7 +10587,210 @@
       </w:pPr>
     </w:lvl>
   </w:abstractNum>
-  <w:abstractNum w:abstractNumId="5" w15:restartNumberingAfterBreak="0">
+  <w:abstractNum w:abstractNumId="7" w15:restartNumberingAfterBreak="0">
+    <w:nsid w:val="32174BFC"/>
+    <w:multiLevelType w:val="hybridMultilevel"/>
+    <w:tmpl w:val="7406ACEA"/>
+    <w:lvl w:ilvl="0" w:tplc="04190001">
+      <w:start w:val="1"/>
+      <w:numFmt w:val="bullet"/>
+      <w:lvlText w:val=""/>
+      <w:lvlJc w:val="left"/>
+      <w:pPr>
+        <w:ind w:left="1429" w:hanging="360"/>
+      </w:pPr>
+      <w:rPr>
+        <w:rFonts w:ascii="Symbol" w:hAnsi="Symbol" w:hint="default"/>
+      </w:rPr>
+    </w:lvl>
+    <w:lvl w:ilvl="1" w:tplc="04190003" w:tentative="1">
+      <w:start w:val="1"/>
+      <w:numFmt w:val="bullet"/>
+      <w:lvlText w:val="o"/>
+      <w:lvlJc w:val="left"/>
+      <w:pPr>
+        <w:ind w:left="2149" w:hanging="360"/>
+      </w:pPr>
+      <w:rPr>
+        <w:rFonts w:ascii="Courier New" w:hAnsi="Courier New" w:cs="Courier New" w:hint="default"/>
+      </w:rPr>
+    </w:lvl>
+    <w:lvl w:ilvl="2" w:tplc="04190005" w:tentative="1">
+      <w:start w:val="1"/>
+      <w:numFmt w:val="bullet"/>
+      <w:lvlText w:val=""/>
+      <w:lvlJc w:val="left"/>
+      <w:pPr>
+        <w:ind w:left="2869" w:hanging="360"/>
+      </w:pPr>
+      <w:rPr>
+        <w:rFonts w:ascii="Wingdings" w:hAnsi="Wingdings" w:hint="default"/>
+      </w:rPr>
+    </w:lvl>
+    <w:lvl w:ilvl="3" w:tplc="04190001" w:tentative="1">
+      <w:start w:val="1"/>
+      <w:numFmt w:val="bullet"/>
+      <w:lvlText w:val=""/>
+      <w:lvlJc w:val="left"/>
+      <w:pPr>
+        <w:ind w:left="3589" w:hanging="360"/>
+      </w:pPr>
+      <w:rPr>
+        <w:rFonts w:ascii="Symbol" w:hAnsi="Symbol" w:hint="default"/>
+      </w:rPr>
+    </w:lvl>
+    <w:lvl w:ilvl="4" w:tplc="04190003" w:tentative="1">
+      <w:start w:val="1"/>
+      <w:numFmt w:val="bullet"/>
+      <w:lvlText w:val="o"/>
+      <w:lvlJc w:val="left"/>
+      <w:pPr>
+        <w:ind w:left="4309" w:hanging="360"/>
+      </w:pPr>
+      <w:rPr>
+        <w:rFonts w:ascii="Courier New" w:hAnsi="Courier New" w:cs="Courier New" w:hint="default"/>
+      </w:rPr>
+    </w:lvl>
+    <w:lvl w:ilvl="5" w:tplc="04190005" w:tentative="1">
+      <w:start w:val="1"/>
+      <w:numFmt w:val="bullet"/>
+      <w:lvlText w:val=""/>
+      <w:lvlJc w:val="left"/>
+      <w:pPr>
+        <w:ind w:left="5029" w:hanging="360"/>
+      </w:pPr>
+      <w:rPr>
+        <w:rFonts w:ascii="Wingdings" w:hAnsi="Wingdings" w:hint="default"/>
+      </w:rPr>
+    </w:lvl>
+    <w:lvl w:ilvl="6" w:tplc="04190001" w:tentative="1">
+      <w:start w:val="1"/>
+      <w:numFmt w:val="bullet"/>
+      <w:lvlText w:val=""/>
+      <w:lvlJc w:val="left"/>
+      <w:pPr>
+        <w:ind w:left="5749" w:hanging="360"/>
+      </w:pPr>
+      <w:rPr>
+        <w:rFonts w:ascii="Symbol" w:hAnsi="Symbol" w:hint="default"/>
+      </w:rPr>
+    </w:lvl>
+    <w:lvl w:ilvl="7" w:tplc="04190003" w:tentative="1">
+      <w:start w:val="1"/>
+      <w:numFmt w:val="bullet"/>
+      <w:lvlText w:val="o"/>
+      <w:lvlJc w:val="left"/>
+      <w:pPr>
+        <w:ind w:left="6469" w:hanging="360"/>
+      </w:pPr>
+      <w:rPr>
+        <w:rFonts w:ascii="Courier New" w:hAnsi="Courier New" w:cs="Courier New" w:hint="default"/>
+      </w:rPr>
+    </w:lvl>
+    <w:lvl w:ilvl="8" w:tplc="04190005" w:tentative="1">
+      <w:start w:val="1"/>
+      <w:numFmt w:val="bullet"/>
+      <w:lvlText w:val=""/>
+      <w:lvlJc w:val="left"/>
+      <w:pPr>
+        <w:ind w:left="7189" w:hanging="360"/>
+      </w:pPr>
+      <w:rPr>
+        <w:rFonts w:ascii="Wingdings" w:hAnsi="Wingdings" w:hint="default"/>
+      </w:rPr>
+    </w:lvl>
+  </w:abstractNum>
+  <w:abstractNum w:abstractNumId="8" w15:restartNumberingAfterBreak="0">
+    <w:nsid w:val="352E524A"/>
+    <w:multiLevelType w:val="hybridMultilevel"/>
+    <w:tmpl w:val="5DE8049E"/>
+    <w:lvl w:ilvl="0" w:tplc="FB849592">
+      <w:start w:val="1"/>
+      <w:numFmt w:val="decimal"/>
+      <w:lvlText w:val="%1."/>
+      <w:lvlJc w:val="left"/>
+      <w:pPr>
+        <w:ind w:left="795" w:hanging="360"/>
+      </w:pPr>
+      <w:rPr>
+        <w:b w:val="0"/>
+        <w:bCs w:val="0"/>
+      </w:rPr>
+    </w:lvl>
+    <w:lvl w:ilvl="1" w:tplc="FFFFFFFF" w:tentative="1">
+      <w:start w:val="1"/>
+      <w:numFmt w:val="lowerLetter"/>
+      <w:lvlText w:val="%2."/>
+      <w:lvlJc w:val="left"/>
+      <w:pPr>
+        <w:ind w:left="1440" w:hanging="360"/>
+      </w:pPr>
+    </w:lvl>
+    <w:lvl w:ilvl="2" w:tplc="FFFFFFFF" w:tentative="1">
+      <w:start w:val="1"/>
+      <w:numFmt w:val="lowerRoman"/>
+      <w:lvlText w:val="%3."/>
+      <w:lvlJc w:val="right"/>
+      <w:pPr>
+        <w:ind w:left="2160" w:hanging="180"/>
+      </w:pPr>
+    </w:lvl>
+    <w:lvl w:ilvl="3" w:tplc="FFFFFFFF" w:tentative="1">
+      <w:start w:val="1"/>
+      <w:numFmt w:val="decimal"/>
+      <w:lvlText w:val="%4."/>
+      <w:lvlJc w:val="left"/>
+      <w:pPr>
+        <w:ind w:left="2880" w:hanging="360"/>
+      </w:pPr>
+    </w:lvl>
+    <w:lvl w:ilvl="4" w:tplc="FFFFFFFF" w:tentative="1">
+      <w:start w:val="1"/>
+      <w:numFmt w:val="lowerLetter"/>
+      <w:lvlText w:val="%5."/>
+      <w:lvlJc w:val="left"/>
+      <w:pPr>
+        <w:ind w:left="3600" w:hanging="360"/>
+      </w:pPr>
+    </w:lvl>
+    <w:lvl w:ilvl="5" w:tplc="FFFFFFFF" w:tentative="1">
+      <w:start w:val="1"/>
+      <w:numFmt w:val="lowerRoman"/>
+      <w:lvlText w:val="%6."/>
+      <w:lvlJc w:val="right"/>
+      <w:pPr>
+        <w:ind w:left="4320" w:hanging="180"/>
+      </w:pPr>
+    </w:lvl>
+    <w:lvl w:ilvl="6" w:tplc="FFFFFFFF" w:tentative="1">
+      <w:start w:val="1"/>
+      <w:numFmt w:val="decimal"/>
+      <w:lvlText w:val="%7."/>
+      <w:lvlJc w:val="left"/>
+      <w:pPr>
+        <w:ind w:left="5040" w:hanging="360"/>
+      </w:pPr>
+    </w:lvl>
+    <w:lvl w:ilvl="7" w:tplc="FFFFFFFF" w:tentative="1">
+      <w:start w:val="1"/>
+      <w:numFmt w:val="lowerLetter"/>
+      <w:lvlText w:val="%8."/>
+      <w:lvlJc w:val="left"/>
+      <w:pPr>
+        <w:ind w:left="5760" w:hanging="360"/>
+      </w:pPr>
+    </w:lvl>
+    <w:lvl w:ilvl="8" w:tplc="FFFFFFFF" w:tentative="1">
+      <w:start w:val="1"/>
+      <w:numFmt w:val="lowerRoman"/>
+      <w:lvlText w:val="%9."/>
+      <w:lvlJc w:val="right"/>
+      <w:pPr>
+        <w:ind w:left="6480" w:hanging="180"/>
+      </w:pPr>
+    </w:lvl>
+  </w:abstractNum>
+  <w:abstractNum w:abstractNumId="9" w15:restartNumberingAfterBreak="0">
     <w:nsid w:val="40C91D96"/>
     <w:multiLevelType w:val="hybridMultilevel"/>
     <w:tmpl w:val="91701B02"/>
@@ -9354,7 +10902,7 @@
       </w:rPr>
     </w:lvl>
   </w:abstractNum>
-  <w:abstractNum w:abstractNumId="6" w15:restartNumberingAfterBreak="0">
+  <w:abstractNum w:abstractNumId="10" w15:restartNumberingAfterBreak="0">
     <w:nsid w:val="430B40F8"/>
     <w:multiLevelType w:val="hybridMultilevel"/>
     <w:tmpl w:val="468CC3CE"/>
@@ -9440,7 +10988,7 @@
       </w:pPr>
     </w:lvl>
   </w:abstractNum>
-  <w:abstractNum w:abstractNumId="7" w15:restartNumberingAfterBreak="0">
+  <w:abstractNum w:abstractNumId="11" w15:restartNumberingAfterBreak="0">
     <w:nsid w:val="498C438E"/>
     <w:multiLevelType w:val="hybridMultilevel"/>
     <w:tmpl w:val="50DED542"/>
@@ -9552,7 +11100,120 @@
       </w:rPr>
     </w:lvl>
   </w:abstractNum>
-  <w:abstractNum w:abstractNumId="8" w15:restartNumberingAfterBreak="0">
+  <w:abstractNum w:abstractNumId="12" w15:restartNumberingAfterBreak="0">
+    <w:nsid w:val="4ABF404B"/>
+    <w:multiLevelType w:val="hybridMultilevel"/>
+    <w:tmpl w:val="7F2AF7F8"/>
+    <w:lvl w:ilvl="0" w:tplc="04190001">
+      <w:start w:val="1"/>
+      <w:numFmt w:val="bullet"/>
+      <w:lvlText w:val=""/>
+      <w:lvlJc w:val="left"/>
+      <w:pPr>
+        <w:ind w:left="1429" w:hanging="360"/>
+      </w:pPr>
+      <w:rPr>
+        <w:rFonts w:ascii="Symbol" w:hAnsi="Symbol" w:hint="default"/>
+      </w:rPr>
+    </w:lvl>
+    <w:lvl w:ilvl="1" w:tplc="04190003" w:tentative="1">
+      <w:start w:val="1"/>
+      <w:numFmt w:val="bullet"/>
+      <w:lvlText w:val="o"/>
+      <w:lvlJc w:val="left"/>
+      <w:pPr>
+        <w:ind w:left="2149" w:hanging="360"/>
+      </w:pPr>
+      <w:rPr>
+        <w:rFonts w:ascii="Courier New" w:hAnsi="Courier New" w:cs="Courier New" w:hint="default"/>
+      </w:rPr>
+    </w:lvl>
+    <w:lvl w:ilvl="2" w:tplc="04190005" w:tentative="1">
+      <w:start w:val="1"/>
+      <w:numFmt w:val="bullet"/>
+      <w:lvlText w:val=""/>
+      <w:lvlJc w:val="left"/>
+      <w:pPr>
+        <w:ind w:left="2869" w:hanging="360"/>
+      </w:pPr>
+      <w:rPr>
+        <w:rFonts w:ascii="Wingdings" w:hAnsi="Wingdings" w:hint="default"/>
+      </w:rPr>
+    </w:lvl>
+    <w:lvl w:ilvl="3" w:tplc="04190001" w:tentative="1">
+      <w:start w:val="1"/>
+      <w:numFmt w:val="bullet"/>
+      <w:lvlText w:val=""/>
+      <w:lvlJc w:val="left"/>
+      <w:pPr>
+        <w:ind w:left="3589" w:hanging="360"/>
+      </w:pPr>
+      <w:rPr>
+        <w:rFonts w:ascii="Symbol" w:hAnsi="Symbol" w:hint="default"/>
+      </w:rPr>
+    </w:lvl>
+    <w:lvl w:ilvl="4" w:tplc="04190003" w:tentative="1">
+      <w:start w:val="1"/>
+      <w:numFmt w:val="bullet"/>
+      <w:lvlText w:val="o"/>
+      <w:lvlJc w:val="left"/>
+      <w:pPr>
+        <w:ind w:left="4309" w:hanging="360"/>
+      </w:pPr>
+      <w:rPr>
+        <w:rFonts w:ascii="Courier New" w:hAnsi="Courier New" w:cs="Courier New" w:hint="default"/>
+      </w:rPr>
+    </w:lvl>
+    <w:lvl w:ilvl="5" w:tplc="04190005" w:tentative="1">
+      <w:start w:val="1"/>
+      <w:numFmt w:val="bullet"/>
+      <w:lvlText w:val=""/>
+      <w:lvlJc w:val="left"/>
+      <w:pPr>
+        <w:ind w:left="5029" w:hanging="360"/>
+      </w:pPr>
+      <w:rPr>
+        <w:rFonts w:ascii="Wingdings" w:hAnsi="Wingdings" w:hint="default"/>
+      </w:rPr>
+    </w:lvl>
+    <w:lvl w:ilvl="6" w:tplc="04190001" w:tentative="1">
+      <w:start w:val="1"/>
+      <w:numFmt w:val="bullet"/>
+      <w:lvlText w:val=""/>
+      <w:lvlJc w:val="left"/>
+      <w:pPr>
+        <w:ind w:left="5749" w:hanging="360"/>
+      </w:pPr>
+      <w:rPr>
+        <w:rFonts w:ascii="Symbol" w:hAnsi="Symbol" w:hint="default"/>
+      </w:rPr>
+    </w:lvl>
+    <w:lvl w:ilvl="7" w:tplc="04190003" w:tentative="1">
+      <w:start w:val="1"/>
+      <w:numFmt w:val="bullet"/>
+      <w:lvlText w:val="o"/>
+      <w:lvlJc w:val="left"/>
+      <w:pPr>
+        <w:ind w:left="6469" w:hanging="360"/>
+      </w:pPr>
+      <w:rPr>
+        <w:rFonts w:ascii="Courier New" w:hAnsi="Courier New" w:cs="Courier New" w:hint="default"/>
+      </w:rPr>
+    </w:lvl>
+    <w:lvl w:ilvl="8" w:tplc="04190005" w:tentative="1">
+      <w:start w:val="1"/>
+      <w:numFmt w:val="bullet"/>
+      <w:lvlText w:val=""/>
+      <w:lvlJc w:val="left"/>
+      <w:pPr>
+        <w:ind w:left="7189" w:hanging="360"/>
+      </w:pPr>
+      <w:rPr>
+        <w:rFonts w:ascii="Wingdings" w:hAnsi="Wingdings" w:hint="default"/>
+      </w:rPr>
+    </w:lvl>
+  </w:abstractNum>
+  <w:abstractNum w:abstractNumId="13" w15:restartNumberingAfterBreak="0">
     <w:nsid w:val="4E7235F5"/>
     <w:multiLevelType w:val="hybridMultilevel"/>
     <w:tmpl w:val="144647F0"/>
@@ -9642,7 +11303,7 @@
       </w:pPr>
     </w:lvl>
   </w:abstractNum>
-  <w:abstractNum w:abstractNumId="9" w15:restartNumberingAfterBreak="0">
+  <w:abstractNum w:abstractNumId="14" w15:restartNumberingAfterBreak="0">
     <w:nsid w:val="58976796"/>
     <w:multiLevelType w:val="multilevel"/>
     <w:tmpl w:val="77CAF1E4"/>
@@ -9791,7 +11452,7 @@
       </w:rPr>
     </w:lvl>
   </w:abstractNum>
-  <w:abstractNum w:abstractNumId="10" w15:restartNumberingAfterBreak="0">
+  <w:abstractNum w:abstractNumId="15" w15:restartNumberingAfterBreak="0">
     <w:nsid w:val="5FB434E9"/>
     <w:multiLevelType w:val="hybridMultilevel"/>
     <w:tmpl w:val="AB58E856"/>
@@ -9904,44 +11565,175 @@
       </w:rPr>
     </w:lvl>
   </w:abstractNum>
+  <w:abstractNum w:abstractNumId="16" w15:restartNumberingAfterBreak="0">
+    <w:nsid w:val="72BA1626"/>
+    <w:multiLevelType w:val="hybridMultilevel"/>
+    <w:tmpl w:val="BC767B8A"/>
+    <w:lvl w:ilvl="0" w:tplc="04190001">
+      <w:start w:val="1"/>
+      <w:numFmt w:val="bullet"/>
+      <w:lvlText w:val=""/>
+      <w:lvlJc w:val="left"/>
+      <w:pPr>
+        <w:ind w:left="1429" w:hanging="360"/>
+      </w:pPr>
+      <w:rPr>
+        <w:rFonts w:ascii="Symbol" w:hAnsi="Symbol" w:hint="default"/>
+      </w:rPr>
+    </w:lvl>
+    <w:lvl w:ilvl="1" w:tplc="04190003" w:tentative="1">
+      <w:start w:val="1"/>
+      <w:numFmt w:val="bullet"/>
+      <w:lvlText w:val="o"/>
+      <w:lvlJc w:val="left"/>
+      <w:pPr>
+        <w:ind w:left="2149" w:hanging="360"/>
+      </w:pPr>
+      <w:rPr>
+        <w:rFonts w:ascii="Courier New" w:hAnsi="Courier New" w:cs="Courier New" w:hint="default"/>
+      </w:rPr>
+    </w:lvl>
+    <w:lvl w:ilvl="2" w:tplc="04190005" w:tentative="1">
+      <w:start w:val="1"/>
+      <w:numFmt w:val="bullet"/>
+      <w:lvlText w:val=""/>
+      <w:lvlJc w:val="left"/>
+      <w:pPr>
+        <w:ind w:left="2869" w:hanging="360"/>
+      </w:pPr>
+      <w:rPr>
+        <w:rFonts w:ascii="Wingdings" w:hAnsi="Wingdings" w:hint="default"/>
+      </w:rPr>
+    </w:lvl>
+    <w:lvl w:ilvl="3" w:tplc="04190001" w:tentative="1">
+      <w:start w:val="1"/>
+      <w:numFmt w:val="bullet"/>
+      <w:lvlText w:val=""/>
+      <w:lvlJc w:val="left"/>
+      <w:pPr>
+        <w:ind w:left="3589" w:hanging="360"/>
+      </w:pPr>
+      <w:rPr>
+        <w:rFonts w:ascii="Symbol" w:hAnsi="Symbol" w:hint="default"/>
+      </w:rPr>
+    </w:lvl>
+    <w:lvl w:ilvl="4" w:tplc="04190003" w:tentative="1">
+      <w:start w:val="1"/>
+      <w:numFmt w:val="bullet"/>
+      <w:lvlText w:val="o"/>
+      <w:lvlJc w:val="left"/>
+      <w:pPr>
+        <w:ind w:left="4309" w:hanging="360"/>
+      </w:pPr>
+      <w:rPr>
+        <w:rFonts w:ascii="Courier New" w:hAnsi="Courier New" w:cs="Courier New" w:hint="default"/>
+      </w:rPr>
+    </w:lvl>
+    <w:lvl w:ilvl="5" w:tplc="04190005" w:tentative="1">
+      <w:start w:val="1"/>
+      <w:numFmt w:val="bullet"/>
+      <w:lvlText w:val=""/>
+      <w:lvlJc w:val="left"/>
+      <w:pPr>
+        <w:ind w:left="5029" w:hanging="360"/>
+      </w:pPr>
+      <w:rPr>
+        <w:rFonts w:ascii="Wingdings" w:hAnsi="Wingdings" w:hint="default"/>
+      </w:rPr>
+    </w:lvl>
+    <w:lvl w:ilvl="6" w:tplc="04190001" w:tentative="1">
+      <w:start w:val="1"/>
+      <w:numFmt w:val="bullet"/>
+      <w:lvlText w:val=""/>
+      <w:lvlJc w:val="left"/>
+      <w:pPr>
+        <w:ind w:left="5749" w:hanging="360"/>
+      </w:pPr>
+      <w:rPr>
+        <w:rFonts w:ascii="Symbol" w:hAnsi="Symbol" w:hint="default"/>
+      </w:rPr>
+    </w:lvl>
+    <w:lvl w:ilvl="7" w:tplc="04190003" w:tentative="1">
+      <w:start w:val="1"/>
+      <w:numFmt w:val="bullet"/>
+      <w:lvlText w:val="o"/>
+      <w:lvlJc w:val="left"/>
+      <w:pPr>
+        <w:ind w:left="6469" w:hanging="360"/>
+      </w:pPr>
+      <w:rPr>
+        <w:rFonts w:ascii="Courier New" w:hAnsi="Courier New" w:cs="Courier New" w:hint="default"/>
+      </w:rPr>
+    </w:lvl>
+    <w:lvl w:ilvl="8" w:tplc="04190005" w:tentative="1">
+      <w:start w:val="1"/>
+      <w:numFmt w:val="bullet"/>
+      <w:lvlText w:val=""/>
+      <w:lvlJc w:val="left"/>
+      <w:pPr>
+        <w:ind w:left="7189" w:hanging="360"/>
+      </w:pPr>
+      <w:rPr>
+        <w:rFonts w:ascii="Wingdings" w:hAnsi="Wingdings" w:hint="default"/>
+      </w:rPr>
+    </w:lvl>
+  </w:abstractNum>
   <w:num w:numId="1" w16cid:durableId="574318857">
-    <w:abstractNumId w:val="9"/>
+    <w:abstractNumId w:val="14"/>
   </w:num>
   <w:num w:numId="2" w16cid:durableId="148794801">
     <w:abstractNumId w:val="0"/>
   </w:num>
   <w:num w:numId="3" w16cid:durableId="602803692">
-    <w:abstractNumId w:val="3"/>
+    <w:abstractNumId w:val="5"/>
   </w:num>
   <w:num w:numId="4" w16cid:durableId="307831813">
+    <w:abstractNumId w:val="15"/>
+  </w:num>
+  <w:num w:numId="5" w16cid:durableId="22902939">
+    <w:abstractNumId w:val="9"/>
+  </w:num>
+  <w:num w:numId="6" w16cid:durableId="407970359">
+    <w:abstractNumId w:val="4"/>
+  </w:num>
+  <w:num w:numId="7" w16cid:durableId="1142188093">
+    <w:abstractNumId w:val="11"/>
+  </w:num>
+  <w:num w:numId="8" w16cid:durableId="1842088553">
+    <w:abstractNumId w:val="6"/>
+  </w:num>
+  <w:num w:numId="9" w16cid:durableId="1317490354">
     <w:abstractNumId w:val="10"/>
   </w:num>
-  <w:num w:numId="5" w16cid:durableId="22902939">
-    <w:abstractNumId w:val="5"/>
-  </w:num>
-  <w:num w:numId="6" w16cid:durableId="407970359">
-    <w:abstractNumId w:val="2"/>
-  </w:num>
-  <w:num w:numId="7" w16cid:durableId="1142188093">
-    <w:abstractNumId w:val="7"/>
-  </w:num>
-  <w:num w:numId="8" w16cid:durableId="1842088553">
-    <w:abstractNumId w:val="4"/>
-  </w:num>
-  <w:num w:numId="9" w16cid:durableId="1317490354">
-    <w:abstractNumId w:val="6"/>
-  </w:num>
   <w:num w:numId="10" w16cid:durableId="1778910573">
-    <w:abstractNumId w:val="8"/>
+    <w:abstractNumId w:val="13"/>
   </w:num>
   <w:num w:numId="11" w16cid:durableId="856695833">
     <w:abstractNumId w:val="1"/>
+  </w:num>
+  <w:num w:numId="12" w16cid:durableId="783770959">
+    <w:abstractNumId w:val="8"/>
+  </w:num>
+  <w:num w:numId="13" w16cid:durableId="2007437495">
+    <w:abstractNumId w:val="16"/>
+  </w:num>
+  <w:num w:numId="14" w16cid:durableId="26682437">
+    <w:abstractNumId w:val="3"/>
+  </w:num>
+  <w:num w:numId="15" w16cid:durableId="1164781343">
+    <w:abstractNumId w:val="2"/>
+  </w:num>
+  <w:num w:numId="16" w16cid:durableId="1003511411">
+    <w:abstractNumId w:val="7"/>
+  </w:num>
+  <w:num w:numId="17" w16cid:durableId="935848">
+    <w:abstractNumId w:val="12"/>
   </w:num>
 </w:numbering>
 </file>
 
 <file path=word/styles.xml><?xml version="1.0" encoding="utf-8"?>
-<w:styles xmlns:mc="http://schemas.openxmlformats.org/markup-compatibility/2006" xmlns:r="http://schemas.openxmlformats.org/officeDocument/2006/relationships" xmlns:w="http://schemas.openxmlformats.org/wordprocessingml/2006/main" xmlns:w14="http://schemas.microsoft.com/office/word/2010/wordml" xmlns:w15="http://schemas.microsoft.com/office/word/2012/wordml" xmlns:w16cex="http://schemas.microsoft.com/office/word/2018/wordml/cex" xmlns:w16cid="http://schemas.microsoft.com/office/word/2016/wordml/cid" xmlns:w16="http://schemas.microsoft.com/office/word/2018/wordml" xmlns:w16du="http://schemas.microsoft.com/office/word/2023/wordml/word16du" xmlns:w16sdtdh="http://schemas.microsoft.com/office/word/2020/wordml/sdtdatahash" xmlns:w16sdtfl="http://schemas.microsoft.com/office/word/2024/wordml/sdtformatlock" xmlns:w16se="http://schemas.microsoft.com/office/word/2015/wordml/symex" mc:Ignorable="w14 w15 w16se w16cid w16 w16cex w16sdtdh w16sdtfl w16du">
+<w:styles xmlns:mc="http://schemas.openxmlformats.org/markup-compatibility/2006" xmlns:r="http://schemas.openxmlformats.org/officeDocument/2006/relationships" xmlns:w="http://schemas.openxmlformats.org/wordprocessingml/2006/main" xmlns:w14="http://schemas.microsoft.com/office/word/2010/wordml" xmlns:w15="http://schemas.microsoft.com/office/word/2012/wordml" xmlns:w16cex="http://schemas.microsoft.com/office/word/2018/wordml/cex" xmlns:w16cid="http://schemas.microsoft.com/office/word/2016/wordml/cid" xmlns:w16="http://schemas.microsoft.com/office/word/2018/wordml" xmlns:w16sdtdh="http://schemas.microsoft.com/office/word/2020/wordml/sdtdatahash" xmlns:w16se="http://schemas.microsoft.com/office/word/2015/wordml/symex" mc:Ignorable="w14 w15 w16se w16cid w16 w16cex w16sdtdh">
   <w:docDefaults>
     <w:rPrDefault>
       <w:rPr>
@@ -10335,7 +12127,7 @@
     <w:lsdException w:name="Unresolved Mention" w:semiHidden="1" w:unhideWhenUsed="1"/>
     <w:lsdException w:name="Smart Link" w:semiHidden="1" w:unhideWhenUsed="1"/>
   </w:latentStyles>
-  <w:style w:type="paragraph" w:default="1" w:styleId="Normal">
+  <w:style w:type="paragraph" w:default="1" w:styleId="a">
     <w:name w:val="Normal"/>
     <w:qFormat/>
     <w:rsid w:val="001A60DB"/>
@@ -10344,11 +12136,11 @@
       <w:sz w:val="28"/>
     </w:rPr>
   </w:style>
-  <w:style w:type="paragraph" w:styleId="Heading1">
+  <w:style w:type="paragraph" w:styleId="1">
     <w:name w:val="heading 1"/>
-    <w:basedOn w:val="Normal"/>
-    <w:next w:val="Normal"/>
-    <w:link w:val="Heading1Char"/>
+    <w:basedOn w:val="a"/>
+    <w:next w:val="a"/>
+    <w:link w:val="10"/>
     <w:autoRedefine/>
     <w:uiPriority w:val="9"/>
     <w:qFormat/>
@@ -10368,13 +12160,36 @@
       <w:szCs w:val="32"/>
     </w:rPr>
   </w:style>
-  <w:style w:type="character" w:default="1" w:styleId="DefaultParagraphFont">
+  <w:style w:type="paragraph" w:styleId="2">
+    <w:name w:val="heading 2"/>
+    <w:basedOn w:val="a"/>
+    <w:next w:val="a"/>
+    <w:link w:val="20"/>
+    <w:uiPriority w:val="9"/>
+    <w:semiHidden/>
+    <w:unhideWhenUsed/>
+    <w:qFormat/>
+    <w:rsid w:val="00AC313D"/>
+    <w:pPr>
+      <w:keepNext/>
+      <w:keepLines/>
+      <w:spacing w:before="40" w:after="0"/>
+      <w:outlineLvl w:val="1"/>
+    </w:pPr>
+    <w:rPr>
+      <w:rFonts w:asciiTheme="majorHAnsi" w:eastAsiaTheme="majorEastAsia" w:hAnsiTheme="majorHAnsi" w:cstheme="majorBidi"/>
+      <w:color w:val="2F5496" w:themeColor="accent1" w:themeShade="BF"/>
+      <w:sz w:val="26"/>
+      <w:szCs w:val="26"/>
+    </w:rPr>
+  </w:style>
+  <w:style w:type="character" w:default="1" w:styleId="a0">
     <w:name w:val="Default Paragraph Font"/>
     <w:uiPriority w:val="1"/>
     <w:semiHidden/>
     <w:unhideWhenUsed/>
   </w:style>
-  <w:style w:type="table" w:default="1" w:styleId="TableNormal">
+  <w:style w:type="table" w:default="1" w:styleId="a1">
     <w:name w:val="Normal Table"/>
     <w:uiPriority w:val="99"/>
     <w:semiHidden/>
@@ -10389,16 +12204,16 @@
       </w:tblCellMar>
     </w:tblPr>
   </w:style>
-  <w:style w:type="numbering" w:default="1" w:styleId="NoList">
+  <w:style w:type="numbering" w:default="1" w:styleId="a2">
     <w:name w:val="No List"/>
     <w:uiPriority w:val="99"/>
     <w:semiHidden/>
     <w:unhideWhenUsed/>
   </w:style>
-  <w:style w:type="character" w:customStyle="1" w:styleId="Heading1Char">
-    <w:name w:val="Heading 1 Char"/>
-    <w:basedOn w:val="DefaultParagraphFont"/>
-    <w:link w:val="Heading1"/>
+  <w:style w:type="character" w:customStyle="1" w:styleId="10">
+    <w:name w:val="Заголовок 1 Знак"/>
+    <w:basedOn w:val="a0"/>
+    <w:link w:val="1"/>
     <w:uiPriority w:val="9"/>
     <w:rsid w:val="00496D6D"/>
     <w:rPr>
@@ -10410,11 +12225,11 @@
       <w:szCs w:val="32"/>
     </w:rPr>
   </w:style>
-  <w:style w:type="paragraph" w:styleId="Title">
+  <w:style w:type="paragraph" w:styleId="a3">
     <w:name w:val="Title"/>
-    <w:basedOn w:val="Normal"/>
-    <w:next w:val="Normal"/>
-    <w:link w:val="TitleChar"/>
+    <w:basedOn w:val="a"/>
+    <w:next w:val="a"/>
+    <w:link w:val="a4"/>
     <w:uiPriority w:val="10"/>
     <w:qFormat/>
     <w:rsid w:val="00496D6D"/>
@@ -10430,10 +12245,10 @@
       <w:szCs w:val="56"/>
     </w:rPr>
   </w:style>
-  <w:style w:type="character" w:customStyle="1" w:styleId="TitleChar">
-    <w:name w:val="Title Char"/>
-    <w:basedOn w:val="DefaultParagraphFont"/>
-    <w:link w:val="Title"/>
+  <w:style w:type="character" w:customStyle="1" w:styleId="a4">
+    <w:name w:val="Заголовок Знак"/>
+    <w:basedOn w:val="a0"/>
+    <w:link w:val="a3"/>
     <w:uiPriority w:val="10"/>
     <w:rsid w:val="00496D6D"/>
     <w:rPr>
@@ -10444,7 +12259,7 @@
       <w:szCs w:val="56"/>
     </w:rPr>
   </w:style>
-  <w:style w:type="paragraph" w:styleId="NoSpacing">
+  <w:style w:type="paragraph" w:styleId="a5">
     <w:name w:val="No Spacing"/>
     <w:uiPriority w:val="1"/>
     <w:qFormat/>
@@ -10453,9 +12268,9 @@
       <w:spacing w:after="0" w:line="240" w:lineRule="auto"/>
     </w:pPr>
   </w:style>
-  <w:style w:type="table" w:styleId="TableGrid">
+  <w:style w:type="table" w:styleId="a6">
     <w:name w:val="Table Grid"/>
-    <w:basedOn w:val="TableNormal"/>
+    <w:basedOn w:val="a1"/>
     <w:uiPriority w:val="39"/>
     <w:rsid w:val="00496D6D"/>
     <w:pPr>
@@ -10472,9 +12287,9 @@
       </w:tblBorders>
     </w:tblPr>
   </w:style>
-  <w:style w:type="paragraph" w:styleId="ListParagraph">
+  <w:style w:type="paragraph" w:styleId="a7">
     <w:name w:val="List Paragraph"/>
-    <w:basedOn w:val="Normal"/>
+    <w:basedOn w:val="a"/>
     <w:uiPriority w:val="34"/>
     <w:qFormat/>
     <w:rsid w:val="009978AE"/>
@@ -10483,10 +12298,10 @@
       <w:contextualSpacing/>
     </w:pPr>
   </w:style>
-  <w:style w:type="paragraph" w:styleId="Caption">
+  <w:style w:type="paragraph" w:styleId="a8">
     <w:name w:val="caption"/>
-    <w:basedOn w:val="Normal"/>
-    <w:next w:val="Normal"/>
+    <w:basedOn w:val="a"/>
+    <w:next w:val="a"/>
     <w:uiPriority w:val="35"/>
     <w:unhideWhenUsed/>
     <w:qFormat/>
@@ -10502,14 +12317,28 @@
       <w:szCs w:val="18"/>
     </w:rPr>
   </w:style>
-  <w:style w:type="character" w:styleId="PlaceholderText">
+  <w:style w:type="character" w:styleId="a9">
     <w:name w:val="Placeholder Text"/>
-    <w:basedOn w:val="DefaultParagraphFont"/>
+    <w:basedOn w:val="a0"/>
     <w:uiPriority w:val="99"/>
     <w:semiHidden/>
     <w:rsid w:val="009F08CD"/>
     <w:rPr>
       <w:color w:val="808080"/>
+    </w:rPr>
+  </w:style>
+  <w:style w:type="character" w:customStyle="1" w:styleId="20">
+    <w:name w:val="Заголовок 2 Знак"/>
+    <w:basedOn w:val="a0"/>
+    <w:link w:val="2"/>
+    <w:uiPriority w:val="9"/>
+    <w:semiHidden/>
+    <w:rsid w:val="00AC313D"/>
+    <w:rPr>
+      <w:rFonts w:asciiTheme="majorHAnsi" w:eastAsiaTheme="majorEastAsia" w:hAnsiTheme="majorHAnsi" w:cstheme="majorBidi"/>
+      <w:color w:val="2F5496" w:themeColor="accent1" w:themeShade="BF"/>
+      <w:sz w:val="26"/>
+      <w:szCs w:val="26"/>
     </w:rPr>
   </w:style>
 </w:styles>

</xml_diff>